<commit_message>
modified:   "\320\233\320\260\320\261\320\276\321\200\320\260\321\202\320\276\321\200\320\275\320\260\321\217 3 \342\200\224 \320\241\320\274\320\270\321\200\320\275\320\276\320\262 \320\220\320\273\320\265\320\272\321\201\320\260\320\275\320\264\321\200 \320\241\320\265\321\200\320\263\320\265\320\265\320\262\320\270\321\207.docx" 	deleted:    "\320\241\321\200\320\260\320\262\320\275\320\265\320\275\320\270\320\265 \321\201 \320\276\320\261\321\200\320\260\320\267\321\206\320\276\320\274.md"
</commit_message>
<xml_diff>
--- a/Лабораторная 3 — Смирнов Александр Сергеевич.docx
+++ b/Лабораторная 3 — Смирнов Александр Сергеевич.docx
@@ -197,14 +197,10 @@
         <w:ind w:left="3" w:right="708" w:firstLine="0"/>
         <w:jc w:val="center"/>
       </w:pPr>
-      <w:r/>
-      <w:r>
-        <w:rPr>
-          <w:rFonts w:ascii="Times New Roman" w:hAnsi="Times New Roman"/>
-          <w:b/>
-          <w:sz w:val="28"/>
-        </w:rPr>
+      <w:r>
         <w:t>ДООБУЧЕНИЕ НЕЙРОСЕТЕЙ</w:t>
+      </w:r>
+      <w:r>
         <w:br/>
         <w:t>ДЛЯ КЛАССИФИКАЦИИ НАСЕКОМЫХ</w:t>
       </w:r>
@@ -306,24 +302,10 @@
         <w:jc w:val="right"/>
       </w:pPr>
       <w:r>
-        <w:rPr>
-          <w:spacing w:val="-2"/>
-        </w:rPr>
-      </w:r>
-      <w:r/>
-      <w:r/>
-      <w:r/>
-      <w:r>
-        <w:rPr>
-          <w:spacing w:val="-5"/>
-        </w:rPr>
-      </w:r>
-      <w:r>
-        <w:rPr>
-          <w:rFonts w:ascii="Times New Roman" w:hAnsi="Times New Roman"/>
-          <w:sz w:val="28"/>
-        </w:rPr>
         <w:t>Студент: Смирнов Александр Сергеевич</w:t>
+      </w:r>
+      <w:r>
+        <w:t xml:space="preserve"> 231-323</w:t>
       </w:r>
     </w:p>
     <w:p>
@@ -350,10 +332,18 @@
         <w:rPr>
           <w:spacing w:val="-2"/>
         </w:rPr>
+        <w:t xml:space="preserve">                                                                                       </w:t>
+      </w:r>
+      <w:r>
+        <w:rPr>
+          <w:spacing w:val="-2"/>
+        </w:rPr>
         <w:t>Преподаватель:</w:t>
       </w:r>
       <w:r>
-        <w:tab/>
+        <w:t xml:space="preserve"> </w:t>
+      </w:r>
+      <w:r>
         <w:t>Гаврилов</w:t>
       </w:r>
       <w:r>
@@ -461,46 +451,55 @@
     <w:p>
       <w:pPr>
         <w:keepNext/>
-        <w:pageBreakBefore w:val="0"/>
         <w:widowControl/>
-        <w:spacing w:line="360" w:lineRule="auto" w:after="100" w:before="0"/>
+        <w:spacing w:after="100" w:line="360" w:lineRule="auto"/>
         <w:jc w:val="both"/>
       </w:pPr>
       <w:r>
         <w:rPr>
-          <w:rFonts w:ascii="Times New Roman" w:hAnsi="Times New Roman"/>
           <w:b/>
           <w:sz w:val="28"/>
         </w:rPr>
+        <w:lastRenderedPageBreak/>
         <w:t>Цель работы</w:t>
       </w:r>
     </w:p>
     <w:p>
       <w:pPr>
         <w:widowControl/>
-        <w:spacing w:line="360" w:lineRule="auto" w:after="100" w:before="0"/>
+        <w:spacing w:after="100" w:line="360" w:lineRule="auto"/>
         <w:jc w:val="both"/>
       </w:pPr>
       <w:r>
         <w:rPr>
-          <w:rFonts w:ascii="Times New Roman" w:hAnsi="Times New Roman"/>
-          <w:b w:val="0"/>
-          <w:sz w:val="28"/>
-        </w:rPr>
-        <w:t>Собрать собственную подборку изображений, сравнить дообучение двух семейств timm и реализовать классификацию через ONNX на CPU. По валидации выбрана ResNet18: на отдельном тесте она дала 25 правильных ответов из 25, MobileNetV3 Small — 23 из 25. Экспортированная модель и локальное приложение проверены.</w:t>
+          <w:sz w:val="28"/>
+        </w:rPr>
+        <w:t xml:space="preserve">Собрать собственную подборку изображений, сравнить дообучение двух семейств </w:t>
+      </w:r>
+      <w:proofErr w:type="spellStart"/>
+      <w:r>
+        <w:rPr>
+          <w:sz w:val="28"/>
+        </w:rPr>
+        <w:t>timm</w:t>
+      </w:r>
+      <w:proofErr w:type="spellEnd"/>
+      <w:r>
+        <w:rPr>
+          <w:sz w:val="28"/>
+        </w:rPr>
+        <w:t xml:space="preserve"> и реализовать классификацию через ONNX на CPU. По валидации выбрана ResNet18: на отдельном тесте она дала 25 правильных ответов из 25, MobileNetV3 Small — 23 из 25. Экспортированная модель и локальное приложение проверены.</w:t>
       </w:r>
     </w:p>
     <w:p>
       <w:pPr>
         <w:keepNext/>
-        <w:pageBreakBefore w:val="0"/>
         <w:widowControl/>
-        <w:spacing w:line="360" w:lineRule="auto" w:after="100" w:before="0"/>
+        <w:spacing w:after="100" w:line="360" w:lineRule="auto"/>
         <w:jc w:val="both"/>
       </w:pPr>
       <w:r>
         <w:rPr>
-          <w:rFonts w:ascii="Times New Roman" w:hAnsi="Times New Roman"/>
           <w:b/>
           <w:sz w:val="28"/>
         </w:rPr>
@@ -510,31 +509,85 @@
     <w:p>
       <w:pPr>
         <w:widowControl/>
-        <w:spacing w:line="360" w:lineRule="auto" w:after="100" w:before="0"/>
+        <w:spacing w:after="100" w:line="360" w:lineRule="auto"/>
         <w:jc w:val="both"/>
       </w:pPr>
       <w:r>
         <w:rPr>
-          <w:rFonts w:ascii="Times New Roman" w:hAnsi="Times New Roman"/>
-          <w:b w:val="0"/>
-          <w:sz w:val="28"/>
-        </w:rPr>
-        <w:t>Вход — фотография взрослого насекомого; выход — один из трёх видов. Подборка Insects Commons 116 собрана 07.09.2026 из отдельных файлов Wikimedia Commons. Это самостоятельный отбор открытых фотографий, а не личная фотосъёмка. Авторы, лицензии и ссылки сохранены для каждого файла в sources.csv и ATTRIBUTION.md.</w:t>
+          <w:sz w:val="28"/>
+        </w:rPr>
+        <w:t xml:space="preserve">Вход — фотография взрослого насекомого; выход — один из трёх видов. Подборка </w:t>
+      </w:r>
+      <w:proofErr w:type="spellStart"/>
+      <w:r>
+        <w:rPr>
+          <w:sz w:val="28"/>
+        </w:rPr>
+        <w:t>Insects</w:t>
+      </w:r>
+      <w:proofErr w:type="spellEnd"/>
+      <w:r>
+        <w:rPr>
+          <w:sz w:val="28"/>
+        </w:rPr>
+        <w:t xml:space="preserve"> </w:t>
+      </w:r>
+      <w:proofErr w:type="spellStart"/>
+      <w:r>
+        <w:rPr>
+          <w:sz w:val="28"/>
+        </w:rPr>
+        <w:t>Commons</w:t>
+      </w:r>
+      <w:proofErr w:type="spellEnd"/>
+      <w:r>
+        <w:rPr>
+          <w:sz w:val="28"/>
+        </w:rPr>
+        <w:t xml:space="preserve"> 116 собрана 07.09.2026 из отдельных файлов </w:t>
+      </w:r>
+      <w:proofErr w:type="spellStart"/>
+      <w:r>
+        <w:rPr>
+          <w:sz w:val="28"/>
+        </w:rPr>
+        <w:t>Wikimedia</w:t>
+      </w:r>
+      <w:proofErr w:type="spellEnd"/>
+      <w:r>
+        <w:rPr>
+          <w:sz w:val="28"/>
+        </w:rPr>
+        <w:t xml:space="preserve"> </w:t>
+      </w:r>
+      <w:proofErr w:type="spellStart"/>
+      <w:r>
+        <w:rPr>
+          <w:sz w:val="28"/>
+        </w:rPr>
+        <w:t>Commons</w:t>
+      </w:r>
+      <w:proofErr w:type="spellEnd"/>
+      <w:r>
+        <w:rPr>
+          <w:sz w:val="28"/>
+        </w:rPr>
+        <w:t>. Это самостоятельный отбор открытых фотографий, а не личная фотосъёмка. Авторы, лицензии и ссылки сохранены для каждого файла в sources.csv и ATTRIBUTION.md.</w:t>
       </w:r>
     </w:p>
     <w:tbl>
       <w:tblPr>
-        <w:tblW w:type="auto" w:w="0"/>
+        <w:tblW w:w="0" w:type="auto"/>
+        <w:tblBorders>
+          <w:top w:val="single" w:sz="4" w:space="0" w:color="808080"/>
+          <w:left w:val="single" w:sz="4" w:space="0" w:color="808080"/>
+          <w:bottom w:val="single" w:sz="4" w:space="0" w:color="808080"/>
+          <w:right w:val="single" w:sz="4" w:space="0" w:color="808080"/>
+          <w:insideH w:val="single" w:sz="4" w:space="0" w:color="808080"/>
+          <w:insideV w:val="single" w:sz="4" w:space="0" w:color="808080"/>
+        </w:tblBorders>
         <w:tblLayout w:type="fixed"/>
-        <w:tblLook w:firstColumn="1" w:firstRow="1" w:lastColumn="0" w:lastRow="0" w:noHBand="0" w:noVBand="1" w:val="04A0"/>
-        <w:tblBorders>
-          <w:top w:val="single" w:sz="4" w:color="808080"/>
-          <w:left w:val="single" w:sz="4" w:color="808080"/>
-          <w:bottom w:val="single" w:sz="4" w:color="808080"/>
-          <w:right w:val="single" w:sz="4" w:color="808080"/>
-          <w:insideH w:val="single" w:sz="4" w:color="808080"/>
-          <w:insideV w:val="single" w:sz="4" w:color="808080"/>
-        </w:tblBorders>
+        <w:tblLook w:val="04A0" w:firstRow="1" w:lastRow="0" w:firstColumn="1" w:lastColumn="0" w:noHBand="0" w:noVBand="1"/>
       </w:tblPr>
       <w:tblGrid>
         <w:gridCol w:w="1938"/>
@@ -550,16 +603,15 @@
         </w:trPr>
         <w:tc>
           <w:tcPr>
-            <w:tcW w:type="dxa" w:w="1938"/>
+            <w:tcW w:w="1938" w:type="dxa"/>
           </w:tcPr>
           <w:p>
             <w:pPr>
-              <w:spacing w:line="240" w:lineRule="auto" w:after="80" w:before="80"/>
+              <w:spacing w:before="80" w:after="80"/>
               <w:jc w:val="center"/>
             </w:pPr>
             <w:r>
               <w:rPr>
-                <w:rFonts w:ascii="Times New Roman" w:hAnsi="Times New Roman"/>
                 <w:b/>
                 <w:sz w:val="24"/>
               </w:rPr>
@@ -569,16 +621,15 @@
         </w:tc>
         <w:tc>
           <w:tcPr>
-            <w:tcW w:type="dxa" w:w="1938"/>
+            <w:tcW w:w="1938" w:type="dxa"/>
           </w:tcPr>
           <w:p>
             <w:pPr>
-              <w:spacing w:line="240" w:lineRule="auto" w:after="80" w:before="80"/>
+              <w:spacing w:before="80" w:after="80"/>
               <w:jc w:val="center"/>
             </w:pPr>
             <w:r>
               <w:rPr>
-                <w:rFonts w:ascii="Times New Roman" w:hAnsi="Times New Roman"/>
                 <w:b/>
                 <w:sz w:val="24"/>
               </w:rPr>
@@ -588,54 +639,55 @@
         </w:tc>
         <w:tc>
           <w:tcPr>
-            <w:tcW w:type="dxa" w:w="1938"/>
+            <w:tcW w:w="1938" w:type="dxa"/>
           </w:tcPr>
           <w:p>
             <w:pPr>
-              <w:spacing w:line="240" w:lineRule="auto" w:after="80" w:before="80"/>
+              <w:spacing w:before="80" w:after="80"/>
               <w:jc w:val="center"/>
             </w:pPr>
-            <w:r>
-              <w:rPr>
-                <w:rFonts w:ascii="Times New Roman" w:hAnsi="Times New Roman"/>
+            <w:proofErr w:type="spellStart"/>
+            <w:r>
+              <w:rPr>
                 <w:b/>
                 <w:sz w:val="24"/>
               </w:rPr>
               <w:t>Train</w:t>
             </w:r>
+            <w:proofErr w:type="spellEnd"/>
           </w:p>
         </w:tc>
         <w:tc>
           <w:tcPr>
-            <w:tcW w:type="dxa" w:w="1938"/>
+            <w:tcW w:w="1938" w:type="dxa"/>
           </w:tcPr>
           <w:p>
             <w:pPr>
-              <w:spacing w:line="240" w:lineRule="auto" w:after="80" w:before="80"/>
+              <w:spacing w:before="80" w:after="80"/>
               <w:jc w:val="center"/>
             </w:pPr>
-            <w:r>
-              <w:rPr>
-                <w:rFonts w:ascii="Times New Roman" w:hAnsi="Times New Roman"/>
+            <w:proofErr w:type="spellStart"/>
+            <w:r>
+              <w:rPr>
                 <w:b/>
                 <w:sz w:val="24"/>
               </w:rPr>
               <w:t>Val</w:t>
             </w:r>
+            <w:proofErr w:type="spellEnd"/>
           </w:p>
         </w:tc>
         <w:tc>
           <w:tcPr>
-            <w:tcW w:type="dxa" w:w="1938"/>
+            <w:tcW w:w="1938" w:type="dxa"/>
           </w:tcPr>
           <w:p>
             <w:pPr>
-              <w:spacing w:line="240" w:lineRule="auto" w:after="80" w:before="80"/>
+              <w:spacing w:before="80" w:after="80"/>
               <w:jc w:val="center"/>
             </w:pPr>
             <w:r>
               <w:rPr>
-                <w:rFonts w:ascii="Times New Roman" w:hAnsi="Times New Roman"/>
                 <w:b/>
                 <w:sz w:val="24"/>
               </w:rPr>
@@ -650,38 +702,62 @@
         </w:trPr>
         <w:tc>
           <w:tcPr>
-            <w:tcW w:type="dxa" w:w="1938"/>
+            <w:tcW w:w="1938" w:type="dxa"/>
           </w:tcPr>
           <w:p>
             <w:pPr>
-              <w:spacing w:line="240" w:lineRule="auto" w:after="80" w:before="80"/>
+              <w:spacing w:before="80" w:after="80"/>
               <w:jc w:val="center"/>
             </w:pPr>
-            <w:r>
-              <w:rPr>
-                <w:rFonts w:ascii="Times New Roman" w:hAnsi="Times New Roman"/>
-                <w:b w:val="0"/>
+            <w:proofErr w:type="spellStart"/>
+            <w:r>
+              <w:rPr>
                 <w:sz w:val="24"/>
               </w:rPr>
               <w:t>butterfly</w:t>
+            </w:r>
+            <w:proofErr w:type="spellEnd"/>
+            <w:r>
+              <w:rPr>
+                <w:sz w:val="24"/>
+              </w:rPr>
               <w:br/>
-              <w:t>Danaus plexippus</w:t>
-            </w:r>
+            </w:r>
+            <w:proofErr w:type="spellStart"/>
+            <w:r>
+              <w:rPr>
+                <w:sz w:val="24"/>
+              </w:rPr>
+              <w:t>Danaus</w:t>
+            </w:r>
+            <w:proofErr w:type="spellEnd"/>
+            <w:r>
+              <w:rPr>
+                <w:sz w:val="24"/>
+              </w:rPr>
+              <w:t xml:space="preserve"> </w:t>
+            </w:r>
+            <w:proofErr w:type="spellStart"/>
+            <w:r>
+              <w:rPr>
+                <w:sz w:val="24"/>
+              </w:rPr>
+              <w:t>plexippus</w:t>
+            </w:r>
+            <w:proofErr w:type="spellEnd"/>
           </w:p>
         </w:tc>
         <w:tc>
           <w:tcPr>
-            <w:tcW w:type="dxa" w:w="1938"/>
+            <w:tcW w:w="1938" w:type="dxa"/>
           </w:tcPr>
           <w:p>
             <w:pPr>
-              <w:spacing w:line="240" w:lineRule="auto" w:after="80" w:before="80"/>
+              <w:spacing w:before="80" w:after="80"/>
               <w:jc w:val="center"/>
             </w:pPr>
             <w:r>
               <w:rPr>
-                <w:rFonts w:ascii="Times New Roman" w:hAnsi="Times New Roman"/>
-                <w:b w:val="0"/>
                 <w:sz w:val="24"/>
               </w:rPr>
               <w:t>36</w:t>
@@ -690,17 +766,15 @@
         </w:tc>
         <w:tc>
           <w:tcPr>
-            <w:tcW w:type="dxa" w:w="1938"/>
+            <w:tcW w:w="1938" w:type="dxa"/>
           </w:tcPr>
           <w:p>
             <w:pPr>
-              <w:spacing w:line="240" w:lineRule="auto" w:after="80" w:before="80"/>
+              <w:spacing w:before="80" w:after="80"/>
               <w:jc w:val="center"/>
             </w:pPr>
             <w:r>
               <w:rPr>
-                <w:rFonts w:ascii="Times New Roman" w:hAnsi="Times New Roman"/>
-                <w:b w:val="0"/>
                 <w:sz w:val="24"/>
               </w:rPr>
               <w:t>22</w:t>
@@ -709,17 +783,15 @@
         </w:tc>
         <w:tc>
           <w:tcPr>
-            <w:tcW w:type="dxa" w:w="1938"/>
+            <w:tcW w:w="1938" w:type="dxa"/>
           </w:tcPr>
           <w:p>
             <w:pPr>
-              <w:spacing w:line="240" w:lineRule="auto" w:after="80" w:before="80"/>
+              <w:spacing w:before="80" w:after="80"/>
               <w:jc w:val="center"/>
             </w:pPr>
             <w:r>
               <w:rPr>
-                <w:rFonts w:ascii="Times New Roman" w:hAnsi="Times New Roman"/>
-                <w:b w:val="0"/>
                 <w:sz w:val="24"/>
               </w:rPr>
               <w:t>7</w:t>
@@ -728,17 +800,15 @@
         </w:tc>
         <w:tc>
           <w:tcPr>
-            <w:tcW w:type="dxa" w:w="1938"/>
+            <w:tcW w:w="1938" w:type="dxa"/>
           </w:tcPr>
           <w:p>
             <w:pPr>
-              <w:spacing w:line="240" w:lineRule="auto" w:after="80" w:before="80"/>
+              <w:spacing w:before="80" w:after="80"/>
               <w:jc w:val="center"/>
             </w:pPr>
             <w:r>
               <w:rPr>
-                <w:rFonts w:ascii="Times New Roman" w:hAnsi="Times New Roman"/>
-                <w:b w:val="0"/>
                 <w:sz w:val="24"/>
               </w:rPr>
               <w:t>7</w:t>
@@ -752,38 +822,62 @@
         </w:trPr>
         <w:tc>
           <w:tcPr>
-            <w:tcW w:type="dxa" w:w="1938"/>
+            <w:tcW w:w="1938" w:type="dxa"/>
           </w:tcPr>
           <w:p>
             <w:pPr>
-              <w:spacing w:line="240" w:lineRule="auto" w:after="80" w:before="80"/>
+              <w:spacing w:before="80" w:after="80"/>
               <w:jc w:val="center"/>
             </w:pPr>
-            <w:r>
-              <w:rPr>
-                <w:rFonts w:ascii="Times New Roman" w:hAnsi="Times New Roman"/>
-                <w:b w:val="0"/>
+            <w:proofErr w:type="spellStart"/>
+            <w:r>
+              <w:rPr>
                 <w:sz w:val="24"/>
               </w:rPr>
               <w:t>dragonfly</w:t>
+            </w:r>
+            <w:proofErr w:type="spellEnd"/>
+            <w:r>
+              <w:rPr>
+                <w:sz w:val="24"/>
+              </w:rPr>
               <w:br/>
-              <w:t>Anax imperator</w:t>
-            </w:r>
+            </w:r>
+            <w:proofErr w:type="spellStart"/>
+            <w:r>
+              <w:rPr>
+                <w:sz w:val="24"/>
+              </w:rPr>
+              <w:t>Anax</w:t>
+            </w:r>
+            <w:proofErr w:type="spellEnd"/>
+            <w:r>
+              <w:rPr>
+                <w:sz w:val="24"/>
+              </w:rPr>
+              <w:t xml:space="preserve"> </w:t>
+            </w:r>
+            <w:proofErr w:type="spellStart"/>
+            <w:r>
+              <w:rPr>
+                <w:sz w:val="24"/>
+              </w:rPr>
+              <w:t>imperator</w:t>
+            </w:r>
+            <w:proofErr w:type="spellEnd"/>
           </w:p>
         </w:tc>
         <w:tc>
           <w:tcPr>
-            <w:tcW w:type="dxa" w:w="1938"/>
+            <w:tcW w:w="1938" w:type="dxa"/>
           </w:tcPr>
           <w:p>
             <w:pPr>
-              <w:spacing w:line="240" w:lineRule="auto" w:after="80" w:before="80"/>
+              <w:spacing w:before="80" w:after="80"/>
               <w:jc w:val="center"/>
             </w:pPr>
             <w:r>
               <w:rPr>
-                <w:rFonts w:ascii="Times New Roman" w:hAnsi="Times New Roman"/>
-                <w:b w:val="0"/>
                 <w:sz w:val="24"/>
               </w:rPr>
               <w:t>39</w:t>
@@ -792,17 +886,15 @@
         </w:tc>
         <w:tc>
           <w:tcPr>
-            <w:tcW w:type="dxa" w:w="1938"/>
+            <w:tcW w:w="1938" w:type="dxa"/>
           </w:tcPr>
           <w:p>
             <w:pPr>
-              <w:spacing w:line="240" w:lineRule="auto" w:after="80" w:before="80"/>
+              <w:spacing w:before="80" w:after="80"/>
               <w:jc w:val="center"/>
             </w:pPr>
             <w:r>
               <w:rPr>
-                <w:rFonts w:ascii="Times New Roman" w:hAnsi="Times New Roman"/>
-                <w:b w:val="0"/>
                 <w:sz w:val="24"/>
               </w:rPr>
               <w:t>23</w:t>
@@ -811,17 +903,15 @@
         </w:tc>
         <w:tc>
           <w:tcPr>
-            <w:tcW w:type="dxa" w:w="1938"/>
+            <w:tcW w:w="1938" w:type="dxa"/>
           </w:tcPr>
           <w:p>
             <w:pPr>
-              <w:spacing w:line="240" w:lineRule="auto" w:after="80" w:before="80"/>
+              <w:spacing w:before="80" w:after="80"/>
               <w:jc w:val="center"/>
             </w:pPr>
             <w:r>
               <w:rPr>
-                <w:rFonts w:ascii="Times New Roman" w:hAnsi="Times New Roman"/>
-                <w:b w:val="0"/>
                 <w:sz w:val="24"/>
               </w:rPr>
               <w:t>7</w:t>
@@ -830,17 +920,15 @@
         </w:tc>
         <w:tc>
           <w:tcPr>
-            <w:tcW w:type="dxa" w:w="1938"/>
+            <w:tcW w:w="1938" w:type="dxa"/>
           </w:tcPr>
           <w:p>
             <w:pPr>
-              <w:spacing w:line="240" w:lineRule="auto" w:after="80" w:before="80"/>
+              <w:spacing w:before="80" w:after="80"/>
               <w:jc w:val="center"/>
             </w:pPr>
             <w:r>
               <w:rPr>
-                <w:rFonts w:ascii="Times New Roman" w:hAnsi="Times New Roman"/>
-                <w:b w:val="0"/>
                 <w:sz w:val="24"/>
               </w:rPr>
               <w:t>9</w:t>
@@ -854,38 +942,62 @@
         </w:trPr>
         <w:tc>
           <w:tcPr>
-            <w:tcW w:type="dxa" w:w="1938"/>
+            <w:tcW w:w="1938" w:type="dxa"/>
           </w:tcPr>
           <w:p>
             <w:pPr>
-              <w:spacing w:line="240" w:lineRule="auto" w:after="80" w:before="80"/>
+              <w:spacing w:before="80" w:after="80"/>
               <w:jc w:val="center"/>
             </w:pPr>
-            <w:r>
-              <w:rPr>
-                <w:rFonts w:ascii="Times New Roman" w:hAnsi="Times New Roman"/>
-                <w:b w:val="0"/>
+            <w:proofErr w:type="spellStart"/>
+            <w:r>
+              <w:rPr>
                 <w:sz w:val="24"/>
               </w:rPr>
               <w:t>ladybird</w:t>
+            </w:r>
+            <w:proofErr w:type="spellEnd"/>
+            <w:r>
+              <w:rPr>
+                <w:sz w:val="24"/>
+              </w:rPr>
               <w:br/>
-              <w:t>Coccinella septempunctata</w:t>
-            </w:r>
+            </w:r>
+            <w:proofErr w:type="spellStart"/>
+            <w:r>
+              <w:rPr>
+                <w:sz w:val="24"/>
+              </w:rPr>
+              <w:t>Coccinella</w:t>
+            </w:r>
+            <w:proofErr w:type="spellEnd"/>
+            <w:r>
+              <w:rPr>
+                <w:sz w:val="24"/>
+              </w:rPr>
+              <w:t xml:space="preserve"> </w:t>
+            </w:r>
+            <w:proofErr w:type="spellStart"/>
+            <w:r>
+              <w:rPr>
+                <w:sz w:val="24"/>
+              </w:rPr>
+              <w:t>septempunctata</w:t>
+            </w:r>
+            <w:proofErr w:type="spellEnd"/>
           </w:p>
         </w:tc>
         <w:tc>
           <w:tcPr>
-            <w:tcW w:type="dxa" w:w="1938"/>
+            <w:tcW w:w="1938" w:type="dxa"/>
           </w:tcPr>
           <w:p>
             <w:pPr>
-              <w:spacing w:line="240" w:lineRule="auto" w:after="80" w:before="80"/>
+              <w:spacing w:before="80" w:after="80"/>
               <w:jc w:val="center"/>
             </w:pPr>
             <w:r>
               <w:rPr>
-                <w:rFonts w:ascii="Times New Roman" w:hAnsi="Times New Roman"/>
-                <w:b w:val="0"/>
                 <w:sz w:val="24"/>
               </w:rPr>
               <w:t>41</w:t>
@@ -894,17 +1006,15 @@
         </w:tc>
         <w:tc>
           <w:tcPr>
-            <w:tcW w:type="dxa" w:w="1938"/>
+            <w:tcW w:w="1938" w:type="dxa"/>
           </w:tcPr>
           <w:p>
             <w:pPr>
-              <w:spacing w:line="240" w:lineRule="auto" w:after="80" w:before="80"/>
+              <w:spacing w:before="80" w:after="80"/>
               <w:jc w:val="center"/>
             </w:pPr>
             <w:r>
               <w:rPr>
-                <w:rFonts w:ascii="Times New Roman" w:hAnsi="Times New Roman"/>
-                <w:b w:val="0"/>
                 <w:sz w:val="24"/>
               </w:rPr>
               <w:t>24</w:t>
@@ -913,17 +1023,15 @@
         </w:tc>
         <w:tc>
           <w:tcPr>
-            <w:tcW w:type="dxa" w:w="1938"/>
+            <w:tcW w:w="1938" w:type="dxa"/>
           </w:tcPr>
           <w:p>
             <w:pPr>
-              <w:spacing w:line="240" w:lineRule="auto" w:after="80" w:before="80"/>
+              <w:spacing w:before="80" w:after="80"/>
               <w:jc w:val="center"/>
             </w:pPr>
             <w:r>
               <w:rPr>
-                <w:rFonts w:ascii="Times New Roman" w:hAnsi="Times New Roman"/>
-                <w:b w:val="0"/>
                 <w:sz w:val="24"/>
               </w:rPr>
               <w:t>8</w:t>
@@ -932,17 +1040,15 @@
         </w:tc>
         <w:tc>
           <w:tcPr>
-            <w:tcW w:type="dxa" w:w="1938"/>
+            <w:tcW w:w="1938" w:type="dxa"/>
           </w:tcPr>
           <w:p>
             <w:pPr>
-              <w:spacing w:line="240" w:lineRule="auto" w:after="80" w:before="80"/>
+              <w:spacing w:before="80" w:after="80"/>
               <w:jc w:val="center"/>
             </w:pPr>
             <w:r>
               <w:rPr>
-                <w:rFonts w:ascii="Times New Roman" w:hAnsi="Times New Roman"/>
-                <w:b w:val="0"/>
                 <w:sz w:val="24"/>
               </w:rPr>
               <w:t>9</w:t>
@@ -956,17 +1062,15 @@
         </w:trPr>
         <w:tc>
           <w:tcPr>
-            <w:tcW w:type="dxa" w:w="1938"/>
+            <w:tcW w:w="1938" w:type="dxa"/>
           </w:tcPr>
           <w:p>
             <w:pPr>
-              <w:spacing w:line="240" w:lineRule="auto" w:after="80" w:before="80"/>
+              <w:spacing w:before="80" w:after="80"/>
               <w:jc w:val="center"/>
             </w:pPr>
             <w:r>
               <w:rPr>
-                <w:rFonts w:ascii="Times New Roman" w:hAnsi="Times New Roman"/>
-                <w:b w:val="0"/>
                 <w:sz w:val="24"/>
               </w:rPr>
               <w:t>Итого</w:t>
@@ -975,17 +1079,15 @@
         </w:tc>
         <w:tc>
           <w:tcPr>
-            <w:tcW w:type="dxa" w:w="1938"/>
+            <w:tcW w:w="1938" w:type="dxa"/>
           </w:tcPr>
           <w:p>
             <w:pPr>
-              <w:spacing w:line="240" w:lineRule="auto" w:after="80" w:before="80"/>
+              <w:spacing w:before="80" w:after="80"/>
               <w:jc w:val="center"/>
             </w:pPr>
             <w:r>
               <w:rPr>
-                <w:rFonts w:ascii="Times New Roman" w:hAnsi="Times New Roman"/>
-                <w:b w:val="0"/>
                 <w:sz w:val="24"/>
               </w:rPr>
               <w:t>116</w:t>
@@ -994,17 +1096,15 @@
         </w:tc>
         <w:tc>
           <w:tcPr>
-            <w:tcW w:type="dxa" w:w="1938"/>
+            <w:tcW w:w="1938" w:type="dxa"/>
           </w:tcPr>
           <w:p>
             <w:pPr>
-              <w:spacing w:line="240" w:lineRule="auto" w:after="80" w:before="80"/>
+              <w:spacing w:before="80" w:after="80"/>
               <w:jc w:val="center"/>
             </w:pPr>
             <w:r>
               <w:rPr>
-                <w:rFonts w:ascii="Times New Roman" w:hAnsi="Times New Roman"/>
-                <w:b w:val="0"/>
                 <w:sz w:val="24"/>
               </w:rPr>
               <w:t>69</w:t>
@@ -1013,17 +1113,15 @@
         </w:tc>
         <w:tc>
           <w:tcPr>
-            <w:tcW w:type="dxa" w:w="1938"/>
+            <w:tcW w:w="1938" w:type="dxa"/>
           </w:tcPr>
           <w:p>
             <w:pPr>
-              <w:spacing w:line="240" w:lineRule="auto" w:after="80" w:before="80"/>
+              <w:spacing w:before="80" w:after="80"/>
               <w:jc w:val="center"/>
             </w:pPr>
             <w:r>
               <w:rPr>
-                <w:rFonts w:ascii="Times New Roman" w:hAnsi="Times New Roman"/>
-                <w:b w:val="0"/>
                 <w:sz w:val="24"/>
               </w:rPr>
               <w:t>22</w:t>
@@ -1032,17 +1130,15 @@
         </w:tc>
         <w:tc>
           <w:tcPr>
-            <w:tcW w:type="dxa" w:w="1938"/>
+            <w:tcW w:w="1938" w:type="dxa"/>
           </w:tcPr>
           <w:p>
             <w:pPr>
-              <w:spacing w:line="240" w:lineRule="auto" w:after="80" w:before="80"/>
+              <w:spacing w:before="80" w:after="80"/>
               <w:jc w:val="center"/>
             </w:pPr>
             <w:r>
               <w:rPr>
-                <w:rFonts w:ascii="Times New Roman" w:hAnsi="Times New Roman"/>
-                <w:b w:val="0"/>
                 <w:sz w:val="24"/>
               </w:rPr>
               <w:t>25</w:t>
@@ -1054,103 +1150,251 @@
     <w:p>
       <w:pPr>
         <w:widowControl/>
-        <w:spacing w:line="360" w:lineRule="auto" w:after="100" w:before="0"/>
+        <w:spacing w:after="100" w:line="360" w:lineRule="auto"/>
         <w:jc w:val="both"/>
       </w:pPr>
       <w:r>
         <w:rPr>
-          <w:rFonts w:ascii="Times New Roman" w:hAnsi="Times New Roman"/>
-          <w:b w:val="0"/>
-          <w:sz w:val="28"/>
-        </w:rPr>
-        <w:t>Классы соответствуют бабочке монарху, стрекозе дозорщик-император и семиточечной божьей коровке. Один вид представляет каждую визуальную группу; модель не является универсальным определителем всех насекомых. Для каждого класса выполнен минимум 30 изображений.</w:t>
+          <w:sz w:val="28"/>
+        </w:rPr>
+        <w:t xml:space="preserve">Классы соответствуют бабочке монарху, стрекозе дозорщик-император и </w:t>
+      </w:r>
+      <w:proofErr w:type="spellStart"/>
+      <w:r>
+        <w:rPr>
+          <w:sz w:val="28"/>
+        </w:rPr>
+        <w:t>семиточечной</w:t>
+      </w:r>
+      <w:proofErr w:type="spellEnd"/>
+      <w:r>
+        <w:rPr>
+          <w:sz w:val="28"/>
+        </w:rPr>
+        <w:t xml:space="preserve"> божьей коровке. Один вид представляет каждую визуальную группу; модель не является универсальным определителем всех насекомых. Для каждого класса выполнен минимум 30 изображений.</w:t>
       </w:r>
     </w:p>
     <w:p>
       <w:pPr>
         <w:widowControl/>
-        <w:spacing w:line="360" w:lineRule="auto" w:after="100" w:before="0"/>
+        <w:spacing w:after="100" w:line="360" w:lineRule="auto"/>
         <w:jc w:val="both"/>
       </w:pPr>
       <w:r>
         <w:rPr>
-          <w:rFonts w:ascii="Times New Roman" w:hAnsi="Times New Roman"/>
-          <w:b w:val="0"/>
-          <w:sz w:val="28"/>
-        </w:rPr>
-        <w:t>В проекте две рабочие папки: experiments — данные, конфигурации, notebook, обучение и артефакты; app — ONNX, общая предобработка и интерфейс. Внутренняя структура экспериментов следует принципам Data Science Cookiecutter.</w:t>
+          <w:sz w:val="28"/>
+        </w:rPr>
+        <w:t xml:space="preserve">В проекте две рабочие папки: </w:t>
+      </w:r>
+      <w:proofErr w:type="spellStart"/>
+      <w:r>
+        <w:rPr>
+          <w:sz w:val="28"/>
+        </w:rPr>
+        <w:t>experiments</w:t>
+      </w:r>
+      <w:proofErr w:type="spellEnd"/>
+      <w:r>
+        <w:rPr>
+          <w:sz w:val="28"/>
+        </w:rPr>
+        <w:t xml:space="preserve"> — данные, конфигурации, </w:t>
+      </w:r>
+      <w:proofErr w:type="spellStart"/>
+      <w:r>
+        <w:rPr>
+          <w:sz w:val="28"/>
+        </w:rPr>
+        <w:t>notebook</w:t>
+      </w:r>
+      <w:proofErr w:type="spellEnd"/>
+      <w:r>
+        <w:rPr>
+          <w:sz w:val="28"/>
+        </w:rPr>
+        <w:t xml:space="preserve">, обучение и артефакты; </w:t>
+      </w:r>
+      <w:proofErr w:type="spellStart"/>
+      <w:r>
+        <w:rPr>
+          <w:sz w:val="28"/>
+        </w:rPr>
+        <w:t>app</w:t>
+      </w:r>
+      <w:proofErr w:type="spellEnd"/>
+      <w:r>
+        <w:rPr>
+          <w:sz w:val="28"/>
+        </w:rPr>
+        <w:t xml:space="preserve"> — ONNX, общая предобработка и интерфейс. Внутренняя структура экспериментов следует принципам Data Science </w:t>
+      </w:r>
+      <w:proofErr w:type="spellStart"/>
+      <w:r>
+        <w:rPr>
+          <w:sz w:val="28"/>
+        </w:rPr>
+        <w:t>Cookiecutter</w:t>
+      </w:r>
+      <w:proofErr w:type="spellEnd"/>
+      <w:r>
+        <w:rPr>
+          <w:sz w:val="28"/>
+        </w:rPr>
+        <w:t>.</w:t>
       </w:r>
     </w:p>
     <w:p>
       <w:pPr>
         <w:keepNext/>
-        <w:pageBreakBefore w:val="0"/>
         <w:widowControl/>
-        <w:spacing w:line="360" w:lineRule="auto" w:after="100" w:before="0"/>
+        <w:spacing w:after="100" w:line="360" w:lineRule="auto"/>
         <w:jc w:val="both"/>
       </w:pPr>
       <w:r>
         <w:rPr>
-          <w:rFonts w:ascii="Times New Roman" w:hAnsi="Times New Roman"/>
           <w:b/>
           <w:sz w:val="28"/>
         </w:rPr>
+        <w:lastRenderedPageBreak/>
         <w:t>Сбор и проверка изображений</w:t>
       </w:r>
     </w:p>
     <w:p>
       <w:pPr>
         <w:widowControl/>
-        <w:spacing w:line="360" w:lineRule="auto" w:after="100" w:before="0"/>
+        <w:spacing w:after="100" w:line="360" w:lineRule="auto"/>
         <w:jc w:val="both"/>
       </w:pPr>
       <w:r>
         <w:rPr>
-          <w:rFonts w:ascii="Times New Roman" w:hAnsi="Times New Roman"/>
-          <w:b w:val="0"/>
-          <w:sz w:val="28"/>
-        </w:rPr>
-        <w:t>Скрипт collect_data.py ищет латинское название вида в заголовках Wikimedia Commons через MediaWiki API. Принимаются растровые изображения с исходной короткой стороной не менее 300 px и открытой лицензией. Сохраняются уменьшенные сервером копии до локальной обработки, URL оригинала, автор, лицензия, размеры и SHA256 файла.</w:t>
+          <w:sz w:val="28"/>
+        </w:rPr>
+        <w:t xml:space="preserve">Скрипт collect_data.py ищет латинское название вида в заголовках </w:t>
+      </w:r>
+      <w:proofErr w:type="spellStart"/>
+      <w:r>
+        <w:rPr>
+          <w:sz w:val="28"/>
+        </w:rPr>
+        <w:t>Wikimedia</w:t>
+      </w:r>
+      <w:proofErr w:type="spellEnd"/>
+      <w:r>
+        <w:rPr>
+          <w:sz w:val="28"/>
+        </w:rPr>
+        <w:t xml:space="preserve"> </w:t>
+      </w:r>
+      <w:proofErr w:type="spellStart"/>
+      <w:r>
+        <w:rPr>
+          <w:sz w:val="28"/>
+        </w:rPr>
+        <w:t>Commons</w:t>
+      </w:r>
+      <w:proofErr w:type="spellEnd"/>
+      <w:r>
+        <w:rPr>
+          <w:sz w:val="28"/>
+        </w:rPr>
+        <w:t xml:space="preserve"> через </w:t>
+      </w:r>
+      <w:proofErr w:type="spellStart"/>
+      <w:r>
+        <w:rPr>
+          <w:sz w:val="28"/>
+        </w:rPr>
+        <w:t>MediaWiki</w:t>
+      </w:r>
+      <w:proofErr w:type="spellEnd"/>
+      <w:r>
+        <w:rPr>
+          <w:sz w:val="28"/>
+        </w:rPr>
+        <w:t xml:space="preserve"> API. Принимаются растровые изображения с исходной короткой стороной не менее 300 </w:t>
+      </w:r>
+      <w:proofErr w:type="spellStart"/>
+      <w:r>
+        <w:rPr>
+          <w:sz w:val="28"/>
+        </w:rPr>
+        <w:t>px</w:t>
+      </w:r>
+      <w:proofErr w:type="spellEnd"/>
+      <w:r>
+        <w:rPr>
+          <w:sz w:val="28"/>
+        </w:rPr>
+        <w:t xml:space="preserve"> и открытой лицензией. Сохраняются уменьшенные сервером копии до локальной обработки, URL оригинала, автор, лицензия, размеры и SHA256 файла.</w:t>
       </w:r>
     </w:p>
     <w:p>
       <w:pPr>
         <w:widowControl/>
-        <w:spacing w:line="360" w:lineRule="auto" w:after="100" w:before="0"/>
+        <w:spacing w:after="100" w:line="360" w:lineRule="auto"/>
         <w:jc w:val="both"/>
       </w:pPr>
       <w:r>
         <w:rPr>
-          <w:rFonts w:ascii="Times New Roman" w:hAnsi="Times New Roman"/>
-          <w:b w:val="0"/>
-          <w:sz w:val="28"/>
-        </w:rPr>
-        <w:t>После первичного фильтра по заголовкам просмотрены 135 кандидатов. Отклонены 19: рисунки, личинки, пустая оболочка, крайние макрофрагменты, слишком мелкие объекты и неоднозначная сцена. Причины сохранены в rejected.csv. Проверки SHA256 RGB-пикселей и dHash с порогом 5 не выявили повторов среди принятых файлов.</w:t>
+          <w:sz w:val="28"/>
+        </w:rPr>
+        <w:t xml:space="preserve">После первичного фильтра по заголовкам просмотрены 135 кандидатов. Отклонены 19: рисунки, личинки, пустая оболочка, крайние </w:t>
+      </w:r>
+      <w:proofErr w:type="spellStart"/>
+      <w:r>
+        <w:rPr>
+          <w:sz w:val="28"/>
+        </w:rPr>
+        <w:t>макрофрагменты</w:t>
+      </w:r>
+      <w:proofErr w:type="spellEnd"/>
+      <w:r>
+        <w:rPr>
+          <w:sz w:val="28"/>
+        </w:rPr>
+        <w:t xml:space="preserve">, слишком мелкие объекты и неоднозначная сцена. Причины сохранены в rejected.csv. Проверки SHA256 RGB-пикселей и </w:t>
+      </w:r>
+      <w:proofErr w:type="spellStart"/>
+      <w:r>
+        <w:rPr>
+          <w:sz w:val="28"/>
+        </w:rPr>
+        <w:t>dHash</w:t>
+      </w:r>
+      <w:proofErr w:type="spellEnd"/>
+      <w:r>
+        <w:rPr>
+          <w:sz w:val="28"/>
+        </w:rPr>
+        <w:t xml:space="preserve"> с порогом 5 не выявили повторов среди принятых файлов.</w:t>
       </w:r>
     </w:p>
     <w:p>
       <w:pPr>
         <w:keepNext/>
-        <w:spacing w:after="0"/>
         <w:jc w:val="center"/>
       </w:pPr>
       <w:r>
+        <w:rPr>
+          <w:noProof/>
+        </w:rPr>
         <w:drawing>
-          <wp:inline xmlns:a="http://schemas.openxmlformats.org/drawingml/2006/main" xmlns:pic="http://schemas.openxmlformats.org/drawingml/2006/picture">
+          <wp:inline distT="0" distB="0" distL="0" distR="0" wp14:anchorId="34BA3F99" wp14:editId="6826B07D">
             <wp:extent cx="4680000" cy="4160000"/>
+            <wp:effectExtent l="0" t="0" r="0" b="0"/>
             <wp:docPr id="1" name="Picture 1" descr="Рисунок 1 — Примеры трёх классов с идентификаторами источников"/>
             <wp:cNvGraphicFramePr>
-              <a:graphicFrameLocks noChangeAspect="1"/>
+              <a:graphicFrameLocks xmlns:a="http://schemas.openxmlformats.org/drawingml/2006/main" noChangeAspect="1"/>
             </wp:cNvGraphicFramePr>
-            <a:graphic>
+            <a:graphic xmlns:a="http://schemas.openxmlformats.org/drawingml/2006/main">
               <a:graphicData uri="http://schemas.openxmlformats.org/drawingml/2006/picture">
-                <pic:pic>
+                <pic:pic xmlns:pic="http://schemas.openxmlformats.org/drawingml/2006/picture">
                   <pic:nvPicPr>
                     <pic:cNvPr id="0" name="examples.png"/>
                     <pic:cNvPicPr/>
                   </pic:nvPicPr>
                   <pic:blipFill>
-                    <a:blip r:embed="rId13"/>
+                    <a:blip r:embed="rId7"/>
                     <a:stretch>
                       <a:fillRect/>
                     </a:stretch>
@@ -1160,7 +1404,9 @@
                       <a:off x="0" y="0"/>
                       <a:ext cx="4680000" cy="4160000"/>
                     </a:xfrm>
-                    <a:prstGeom prst="rect"/>
+                    <a:prstGeom prst="rect">
+                      <a:avLst/>
+                    </a:prstGeom>
                   </pic:spPr>
                 </pic:pic>
               </a:graphicData>
@@ -1172,13 +1418,11 @@
     <w:p>
       <w:pPr>
         <w:widowControl/>
-        <w:spacing w:line="240" w:lineRule="auto" w:after="100" w:before="0"/>
+        <w:spacing w:after="100"/>
         <w:jc w:val="center"/>
       </w:pPr>
       <w:r>
         <w:rPr>
-          <w:rFonts w:ascii="Times New Roman" w:hAnsi="Times New Roman"/>
-          <w:b w:val="0"/>
           <w:sz w:val="24"/>
         </w:rPr>
         <w:t>Рисунок 1 — Примеры трёх классов с идентификаторами источников</w:t>
@@ -1187,29 +1431,46 @@
     <w:p>
       <w:pPr>
         <w:widowControl/>
-        <w:spacing w:line="360" w:lineRule="auto" w:after="100" w:before="0"/>
+        <w:spacing w:after="100" w:line="360" w:lineRule="auto"/>
         <w:jc w:val="both"/>
       </w:pPr>
       <w:r>
         <w:rPr>
-          <w:rFonts w:ascii="Times New Roman" w:hAnsi="Times New Roman"/>
-          <w:b w:val="0"/>
-          <w:sz w:val="28"/>
-        </w:rPr>
-        <w:t>Разделение выполнено по 68 авторским группам: один автор присутствует только в одной части. Из 20 000 назначений с seed = 42 выбрано ближайшее к долям 60/20/20 с ограничением минимальных размеров. Метрики сети при разделении не использовались. Это уменьшает утечку похожих кадров из одной серии.</w:t>
+          <w:sz w:val="28"/>
+        </w:rPr>
+        <w:t xml:space="preserve">Разделение выполнено по 68 авторским группам: один автор присутствует только в одной части. Из 20 000 назначений с </w:t>
+      </w:r>
+      <w:proofErr w:type="spellStart"/>
+      <w:r>
+        <w:rPr>
+          <w:sz w:val="28"/>
+        </w:rPr>
+        <w:t>seed</w:t>
+      </w:r>
+      <w:proofErr w:type="spellEnd"/>
+      <w:r>
+        <w:rPr>
+          <w:sz w:val="28"/>
+        </w:rPr>
+        <w:t xml:space="preserve"> = 42 выбрано ближайшее к долям </w:t>
+      </w:r>
+      <w:r>
+        <w:rPr>
+          <w:sz w:val="28"/>
+        </w:rPr>
+        <w:lastRenderedPageBreak/>
+        <w:t>60/20/20 с ограничением минимальных размеров. Метрики сети при разделении не использовались. Это уменьшает утечку похожих кадров из одной серии.</w:t>
       </w:r>
     </w:p>
     <w:p>
       <w:pPr>
         <w:keepNext/>
-        <w:pageBreakBefore w:val="0"/>
         <w:widowControl/>
-        <w:spacing w:line="360" w:lineRule="auto" w:after="100" w:before="0"/>
+        <w:spacing w:after="100" w:line="360" w:lineRule="auto"/>
         <w:jc w:val="both"/>
       </w:pPr>
       <w:r>
         <w:rPr>
-          <w:rFonts w:ascii="Times New Roman" w:hAnsi="Times New Roman"/>
           <w:b/>
           <w:sz w:val="28"/>
         </w:rPr>
@@ -1219,29 +1480,81 @@
     <w:p>
       <w:pPr>
         <w:widowControl/>
-        <w:spacing w:line="360" w:lineRule="auto" w:after="100" w:before="0"/>
+        <w:spacing w:after="100" w:line="360" w:lineRule="auto"/>
         <w:jc w:val="both"/>
       </w:pPr>
       <w:r>
         <w:rPr>
-          <w:rFonts w:ascii="Times New Roman" w:hAnsi="Times New Roman"/>
-          <w:b w:val="0"/>
-          <w:sz w:val="28"/>
-        </w:rPr>
-        <w:t>Использованы resnet18.a1_in1k и mobilenetv3_small_100.lamb_in1k с весами ImageNet из timm. ResNet18 основана на остаточных связях; MobileNetV3 Small использует компактные блоки с depthwise-свёртками. При создании num_classes = 3 заменяет конечный классификатор. Число параметров после замены: 11 178 051 и 1 520 931 соответственно [1, 2].</w:t>
+          <w:sz w:val="28"/>
+        </w:rPr>
+        <w:t xml:space="preserve">Использованы resnet18.a1_in1k и mobilenetv3_small_100.lamb_in1k с весами </w:t>
+      </w:r>
+      <w:proofErr w:type="spellStart"/>
+      <w:r>
+        <w:rPr>
+          <w:sz w:val="28"/>
+        </w:rPr>
+        <w:t>ImageNet</w:t>
+      </w:r>
+      <w:proofErr w:type="spellEnd"/>
+      <w:r>
+        <w:rPr>
+          <w:sz w:val="28"/>
+        </w:rPr>
+        <w:t xml:space="preserve"> из </w:t>
+      </w:r>
+      <w:proofErr w:type="spellStart"/>
+      <w:r>
+        <w:rPr>
+          <w:sz w:val="28"/>
+        </w:rPr>
+        <w:t>timm</w:t>
+      </w:r>
+      <w:proofErr w:type="spellEnd"/>
+      <w:r>
+        <w:rPr>
+          <w:sz w:val="28"/>
+        </w:rPr>
+        <w:t xml:space="preserve">. ResNet18 основана на остаточных связях; MobileNetV3 Small использует компактные блоки с </w:t>
+      </w:r>
+      <w:proofErr w:type="spellStart"/>
+      <w:r>
+        <w:rPr>
+          <w:sz w:val="28"/>
+        </w:rPr>
+        <w:t>depthwise</w:t>
+      </w:r>
+      <w:proofErr w:type="spellEnd"/>
+      <w:r>
+        <w:rPr>
+          <w:sz w:val="28"/>
+        </w:rPr>
+        <w:t xml:space="preserve">-свёртками. При создании </w:t>
+      </w:r>
+      <w:proofErr w:type="spellStart"/>
+      <w:r>
+        <w:rPr>
+          <w:sz w:val="28"/>
+        </w:rPr>
+        <w:t>num_classes</w:t>
+      </w:r>
+      <w:proofErr w:type="spellEnd"/>
+      <w:r>
+        <w:rPr>
+          <w:sz w:val="28"/>
+        </w:rPr>
+        <w:t xml:space="preserve"> = 3 заменяет конечный классификатор. Число параметров после замены: 11 178 051 и 1 520 931 соответственно [1, 2].</w:t>
       </w:r>
     </w:p>
     <w:p>
       <w:pPr>
         <w:keepNext/>
-        <w:pageBreakBefore w:val="0"/>
         <w:widowControl/>
-        <w:spacing w:line="360" w:lineRule="auto" w:after="100" w:before="0"/>
+        <w:spacing w:after="100" w:line="360" w:lineRule="auto"/>
         <w:jc w:val="both"/>
       </w:pPr>
       <w:r>
         <w:rPr>
-          <w:rFonts w:ascii="Times New Roman" w:hAnsi="Times New Roman"/>
           <w:b/>
           <w:sz w:val="28"/>
         </w:rPr>
@@ -1251,44 +1564,158 @@
     <w:p>
       <w:pPr>
         <w:widowControl/>
-        <w:spacing w:line="360" w:lineRule="auto" w:after="100" w:before="0"/>
+        <w:spacing w:after="100" w:line="360" w:lineRule="auto"/>
         <w:jc w:val="both"/>
       </w:pPr>
       <w:r>
         <w:rPr>
-          <w:rFonts w:ascii="Times New Roman" w:hAnsi="Times New Roman"/>
-          <w:b w:val="0"/>
-          <w:sz w:val="28"/>
-        </w:rPr>
-        <w:t>Только для train применяются RandomResizedCrop до 160 × 160 с площадью 75–100% исходной, случайное горизонтальное отражение и ColorJitter(0.15, 0.15, 0.1, 0.03). Они моделируют вариации масштаба, положения и освещения. Сильное стирание не применяется: на части фото насекомое занимает небольшую область и могло бы исчезнуть.</w:t>
+          <w:sz w:val="28"/>
+        </w:rPr>
+        <w:t xml:space="preserve">Только для </w:t>
+      </w:r>
+      <w:proofErr w:type="spellStart"/>
+      <w:r>
+        <w:rPr>
+          <w:sz w:val="28"/>
+        </w:rPr>
+        <w:t>train</w:t>
+      </w:r>
+      <w:proofErr w:type="spellEnd"/>
+      <w:r>
+        <w:rPr>
+          <w:sz w:val="28"/>
+        </w:rPr>
+        <w:t xml:space="preserve"> применяются </w:t>
+      </w:r>
+      <w:proofErr w:type="spellStart"/>
+      <w:r>
+        <w:rPr>
+          <w:sz w:val="28"/>
+        </w:rPr>
+        <w:t>RandomResizedCrop</w:t>
+      </w:r>
+      <w:proofErr w:type="spellEnd"/>
+      <w:r>
+        <w:rPr>
+          <w:sz w:val="28"/>
+        </w:rPr>
+        <w:t xml:space="preserve"> до 160 × 160 с площадью 75–100% исходной, случайное горизонтальное отражение и </w:t>
+      </w:r>
+      <w:proofErr w:type="spellStart"/>
+      <w:proofErr w:type="gramStart"/>
+      <w:r>
+        <w:rPr>
+          <w:sz w:val="28"/>
+        </w:rPr>
+        <w:t>ColorJitter</w:t>
+      </w:r>
+      <w:proofErr w:type="spellEnd"/>
+      <w:r>
+        <w:rPr>
+          <w:sz w:val="28"/>
+        </w:rPr>
+        <w:t>(</w:t>
+      </w:r>
+      <w:proofErr w:type="gramEnd"/>
+      <w:r>
+        <w:rPr>
+          <w:sz w:val="28"/>
+        </w:rPr>
+        <w:t>0.15, 0.15, 0.1, 0.03). Они моделируют вариации масштаба, положения и освещения. Сильное стирание не применяется: на части фото насекомое занимает небольшую область и могло бы исчезнуть.</w:t>
       </w:r>
     </w:p>
     <w:p>
       <w:pPr>
         <w:widowControl/>
-        <w:spacing w:line="360" w:lineRule="auto" w:after="100" w:before="0"/>
+        <w:spacing w:after="100" w:line="360" w:lineRule="auto"/>
         <w:jc w:val="both"/>
       </w:pPr>
       <w:r>
         <w:rPr>
-          <w:rFonts w:ascii="Times New Roman" w:hAnsi="Times New Roman"/>
-          <w:b w:val="0"/>
-          <w:sz w:val="28"/>
-        </w:rPr>
-        <w:t>Общая предобработка: коррекция EXIF, RGB, центральный квадрат ImageOps.fit с BICUBIC 160 × 160, деление на 255, нормализация mean = (0.485, 0.456, 0.406), std = (0.229, 0.224, 0.225), формат CHW float32. Разрешение уменьшено относительно исходного pretrained-протокола ради CPU-бюджета; обе модели дообучаются и оцениваются при нём.</w:t>
+          <w:sz w:val="28"/>
+        </w:rPr>
+        <w:t xml:space="preserve">Общая предобработка: коррекция EXIF, RGB, центральный квадрат </w:t>
+      </w:r>
+      <w:proofErr w:type="spellStart"/>
+      <w:r>
+        <w:rPr>
+          <w:sz w:val="28"/>
+        </w:rPr>
+        <w:t>ImageOps.fit</w:t>
+      </w:r>
+      <w:proofErr w:type="spellEnd"/>
+      <w:r>
+        <w:rPr>
+          <w:sz w:val="28"/>
+        </w:rPr>
+        <w:t xml:space="preserve"> с BICUBIC 160 × 160, деление на 255, нормализация </w:t>
+      </w:r>
+      <w:proofErr w:type="spellStart"/>
+      <w:r>
+        <w:rPr>
+          <w:sz w:val="28"/>
+        </w:rPr>
+        <w:t>mean</w:t>
+      </w:r>
+      <w:proofErr w:type="spellEnd"/>
+      <w:r>
+        <w:rPr>
+          <w:sz w:val="28"/>
+        </w:rPr>
+        <w:t xml:space="preserve"> = (0.485, 0.456, 0.406), </w:t>
+      </w:r>
+      <w:proofErr w:type="spellStart"/>
+      <w:r>
+        <w:rPr>
+          <w:sz w:val="28"/>
+        </w:rPr>
+        <w:t>std</w:t>
+      </w:r>
+      <w:proofErr w:type="spellEnd"/>
+      <w:r>
+        <w:rPr>
+          <w:sz w:val="28"/>
+        </w:rPr>
+        <w:t xml:space="preserve"> = (0.229, 0.224, 0.225), формат CHW float32. Разрешение уменьшено относительно исходного </w:t>
+      </w:r>
+      <w:proofErr w:type="spellStart"/>
+      <w:r>
+        <w:rPr>
+          <w:sz w:val="28"/>
+        </w:rPr>
+        <w:t>pretrained</w:t>
+      </w:r>
+      <w:proofErr w:type="spellEnd"/>
+      <w:r>
+        <w:rPr>
+          <w:sz w:val="28"/>
+        </w:rPr>
+        <w:t xml:space="preserve">-протокола ради CPU-бюджета; обе модели </w:t>
+      </w:r>
+      <w:proofErr w:type="spellStart"/>
+      <w:r>
+        <w:rPr>
+          <w:sz w:val="28"/>
+        </w:rPr>
+        <w:t>дообучаются</w:t>
+      </w:r>
+      <w:proofErr w:type="spellEnd"/>
+      <w:r>
+        <w:rPr>
+          <w:sz w:val="28"/>
+        </w:rPr>
+        <w:t xml:space="preserve"> и оцениваются при нём.</w:t>
       </w:r>
     </w:p>
     <w:p>
       <w:pPr>
         <w:keepNext/>
-        <w:pageBreakBefore w:val="0"/>
         <w:widowControl/>
-        <w:spacing w:line="360" w:lineRule="auto" w:after="100" w:before="0"/>
+        <w:spacing w:after="100" w:line="360" w:lineRule="auto"/>
         <w:jc w:val="both"/>
       </w:pPr>
       <w:r>
         <w:rPr>
-          <w:rFonts w:ascii="Times New Roman" w:hAnsi="Times New Roman"/>
           <w:b/>
           <w:sz w:val="28"/>
         </w:rPr>
@@ -1298,44 +1725,229 @@
     <w:p>
       <w:pPr>
         <w:widowControl/>
-        <w:spacing w:line="360" w:lineRule="auto" w:after="100" w:before="0"/>
+        <w:spacing w:after="100" w:line="360" w:lineRule="auto"/>
         <w:jc w:val="both"/>
       </w:pPr>
       <w:r>
         <w:rPr>
-          <w:rFonts w:ascii="Times New Roman" w:hAnsi="Times New Roman"/>
-          <w:b w:val="0"/>
-          <w:sz w:val="28"/>
-        </w:rPr>
-        <w:t>Первые две эпохи обучается только конечный классификатор. Backbone работает в eval, поэтому статистики BatchNorm также заморожены. С третьей эпохи размораживаются все веса и включается train. Новый AdamW использует шаг backbone в 10 раз меньше шага головы, что ограничивает изменение ранее выученных признаков.</w:t>
+          <w:sz w:val="28"/>
+        </w:rPr>
+        <w:t xml:space="preserve">Первые две эпохи обучается только конечный классификатор. </w:t>
+      </w:r>
+      <w:proofErr w:type="spellStart"/>
+      <w:r>
+        <w:rPr>
+          <w:sz w:val="28"/>
+        </w:rPr>
+        <w:t>Backbone</w:t>
+      </w:r>
+      <w:proofErr w:type="spellEnd"/>
+      <w:r>
+        <w:rPr>
+          <w:sz w:val="28"/>
+        </w:rPr>
+        <w:t xml:space="preserve"> работает в </w:t>
+      </w:r>
+      <w:proofErr w:type="spellStart"/>
+      <w:r>
+        <w:rPr>
+          <w:sz w:val="28"/>
+        </w:rPr>
+        <w:t>eval</w:t>
+      </w:r>
+      <w:proofErr w:type="spellEnd"/>
+      <w:r>
+        <w:rPr>
+          <w:sz w:val="28"/>
+        </w:rPr>
+        <w:t xml:space="preserve">, поэтому статистики </w:t>
+      </w:r>
+      <w:proofErr w:type="spellStart"/>
+      <w:r>
+        <w:rPr>
+          <w:sz w:val="28"/>
+        </w:rPr>
+        <w:t>BatchNorm</w:t>
+      </w:r>
+      <w:proofErr w:type="spellEnd"/>
+      <w:r>
+        <w:rPr>
+          <w:sz w:val="28"/>
+        </w:rPr>
+        <w:t xml:space="preserve"> также заморожены. С третьей эпохи размораживаются все веса и включается </w:t>
+      </w:r>
+      <w:proofErr w:type="spellStart"/>
+      <w:r>
+        <w:rPr>
+          <w:sz w:val="28"/>
+        </w:rPr>
+        <w:t>train</w:t>
+      </w:r>
+      <w:proofErr w:type="spellEnd"/>
+      <w:r>
+        <w:rPr>
+          <w:sz w:val="28"/>
+        </w:rPr>
+        <w:t xml:space="preserve">. Новый </w:t>
+      </w:r>
+      <w:proofErr w:type="spellStart"/>
+      <w:r>
+        <w:rPr>
+          <w:sz w:val="28"/>
+        </w:rPr>
+        <w:t>AdamW</w:t>
+      </w:r>
+      <w:proofErr w:type="spellEnd"/>
+      <w:r>
+        <w:rPr>
+          <w:sz w:val="28"/>
+        </w:rPr>
+        <w:t xml:space="preserve"> использует шаг </w:t>
+      </w:r>
+      <w:proofErr w:type="spellStart"/>
+      <w:r>
+        <w:rPr>
+          <w:sz w:val="28"/>
+        </w:rPr>
+        <w:t>backbone</w:t>
+      </w:r>
+      <w:proofErr w:type="spellEnd"/>
+      <w:r>
+        <w:rPr>
+          <w:sz w:val="28"/>
+        </w:rPr>
+        <w:t xml:space="preserve"> в 10 раз меньше шага головы, что ограничивает изменение ранее выученных признаков.</w:t>
       </w:r>
     </w:p>
     <w:p>
       <w:pPr>
         <w:widowControl/>
-        <w:spacing w:line="360" w:lineRule="auto" w:after="100" w:before="0"/>
+        <w:spacing w:after="100" w:line="360" w:lineRule="auto"/>
         <w:jc w:val="both"/>
       </w:pPr>
-      <w:r>
-        <w:rPr>
-          <w:rFonts w:ascii="Times New Roman" w:hAnsi="Times New Roman"/>
-          <w:b w:val="0"/>
-          <w:sz w:val="28"/>
-        </w:rPr>
-        <w:t>Validation, test и приложение вызывают одну функцию app/preprocessing.py. При оценке отсутствуют случайные аугментации. Train accuracy измеряется на аугментированных пакетах при обновлении весов, validation accuracy — на фиксированных изображениях в конце эпохи; эти кривые не полностью эквивалентны.</w:t>
+      <w:proofErr w:type="spellStart"/>
+      <w:r>
+        <w:rPr>
+          <w:sz w:val="28"/>
+        </w:rPr>
+        <w:lastRenderedPageBreak/>
+        <w:t>Validation</w:t>
+      </w:r>
+      <w:proofErr w:type="spellEnd"/>
+      <w:r>
+        <w:rPr>
+          <w:sz w:val="28"/>
+        </w:rPr>
+        <w:t xml:space="preserve">, </w:t>
+      </w:r>
+      <w:proofErr w:type="spellStart"/>
+      <w:r>
+        <w:rPr>
+          <w:sz w:val="28"/>
+        </w:rPr>
+        <w:t>test</w:t>
+      </w:r>
+      <w:proofErr w:type="spellEnd"/>
+      <w:r>
+        <w:rPr>
+          <w:sz w:val="28"/>
+        </w:rPr>
+        <w:t xml:space="preserve"> и приложение вызывают одну функцию </w:t>
+      </w:r>
+      <w:proofErr w:type="spellStart"/>
+      <w:r>
+        <w:rPr>
+          <w:sz w:val="28"/>
+        </w:rPr>
+        <w:t>app</w:t>
+      </w:r>
+      <w:proofErr w:type="spellEnd"/>
+      <w:r>
+        <w:rPr>
+          <w:sz w:val="28"/>
+        </w:rPr>
+        <w:t xml:space="preserve">/preprocessing.py. При оценке отсутствуют случайные аугментации. </w:t>
+      </w:r>
+      <w:proofErr w:type="spellStart"/>
+      <w:r>
+        <w:rPr>
+          <w:sz w:val="28"/>
+        </w:rPr>
+        <w:t>Train</w:t>
+      </w:r>
+      <w:proofErr w:type="spellEnd"/>
+      <w:r>
+        <w:rPr>
+          <w:sz w:val="28"/>
+        </w:rPr>
+        <w:t xml:space="preserve"> </w:t>
+      </w:r>
+      <w:proofErr w:type="spellStart"/>
+      <w:r>
+        <w:rPr>
+          <w:sz w:val="28"/>
+        </w:rPr>
+        <w:t>accuracy</w:t>
+      </w:r>
+      <w:proofErr w:type="spellEnd"/>
+      <w:r>
+        <w:rPr>
+          <w:sz w:val="28"/>
+        </w:rPr>
+        <w:t xml:space="preserve"> измеряется на </w:t>
+      </w:r>
+      <w:proofErr w:type="spellStart"/>
+      <w:r>
+        <w:rPr>
+          <w:sz w:val="28"/>
+        </w:rPr>
+        <w:t>аугментированных</w:t>
+      </w:r>
+      <w:proofErr w:type="spellEnd"/>
+      <w:r>
+        <w:rPr>
+          <w:sz w:val="28"/>
+        </w:rPr>
+        <w:t xml:space="preserve"> пакетах при обновлении весов, </w:t>
+      </w:r>
+      <w:proofErr w:type="spellStart"/>
+      <w:r>
+        <w:rPr>
+          <w:sz w:val="28"/>
+        </w:rPr>
+        <w:t>validation</w:t>
+      </w:r>
+      <w:proofErr w:type="spellEnd"/>
+      <w:r>
+        <w:rPr>
+          <w:sz w:val="28"/>
+        </w:rPr>
+        <w:t xml:space="preserve"> </w:t>
+      </w:r>
+      <w:proofErr w:type="spellStart"/>
+      <w:r>
+        <w:rPr>
+          <w:sz w:val="28"/>
+        </w:rPr>
+        <w:t>accuracy</w:t>
+      </w:r>
+      <w:proofErr w:type="spellEnd"/>
+      <w:r>
+        <w:rPr>
+          <w:sz w:val="28"/>
+        </w:rPr>
+        <w:t xml:space="preserve"> — на фиксированных изображениях в конце эпохи; эти кривые не полностью эквивалентны.</w:t>
       </w:r>
     </w:p>
     <w:p>
       <w:pPr>
         <w:keepNext/>
-        <w:pageBreakBefore w:val="0"/>
         <w:widowControl/>
-        <w:spacing w:line="360" w:lineRule="auto" w:after="100" w:before="0"/>
+        <w:spacing w:after="100" w:line="360" w:lineRule="auto"/>
         <w:jc w:val="both"/>
       </w:pPr>
       <w:r>
         <w:rPr>
-          <w:rFonts w:ascii="Times New Roman" w:hAnsi="Times New Roman"/>
           <w:b/>
           <w:sz w:val="28"/>
         </w:rPr>
@@ -1345,31 +1957,155 @@
     <w:p>
       <w:pPr>
         <w:widowControl/>
-        <w:spacing w:line="360" w:lineRule="auto" w:after="100" w:before="0"/>
+        <w:spacing w:after="100" w:line="360" w:lineRule="auto"/>
         <w:jc w:val="both"/>
       </w:pPr>
       <w:r>
         <w:rPr>
-          <w:rFonts w:ascii="Times New Roman" w:hAnsi="Times New Roman"/>
-          <w:b w:val="0"/>
-          <w:sz w:val="28"/>
-        </w:rPr>
-        <w:t>Эксперименты выполнены в Jupyter notebook на CPU. Сетка содержит две архитектуры и два шага головы: 0.001 и 0.0003; шаг backbone равен head/10. Для каждого запуска: 6 эпох, batch = 8, AdamW, weight decay = 0.0001, freeze_epochs = 2. Небольшой бюджет выбран для CPU; результаты не описывают сходимость при произвольно долгом обучении.</w:t>
+          <w:sz w:val="28"/>
+        </w:rPr>
+        <w:t xml:space="preserve">Эксперименты выполнены в </w:t>
+      </w:r>
+      <w:proofErr w:type="spellStart"/>
+      <w:r>
+        <w:rPr>
+          <w:sz w:val="28"/>
+        </w:rPr>
+        <w:t>Jupyter</w:t>
+      </w:r>
+      <w:proofErr w:type="spellEnd"/>
+      <w:r>
+        <w:rPr>
+          <w:sz w:val="28"/>
+        </w:rPr>
+        <w:t xml:space="preserve"> </w:t>
+      </w:r>
+      <w:proofErr w:type="spellStart"/>
+      <w:r>
+        <w:rPr>
+          <w:sz w:val="28"/>
+        </w:rPr>
+        <w:t>notebook</w:t>
+      </w:r>
+      <w:proofErr w:type="spellEnd"/>
+      <w:r>
+        <w:rPr>
+          <w:sz w:val="28"/>
+        </w:rPr>
+        <w:t xml:space="preserve"> на CPU. Сетка содержит две архитектуры и два шага головы: 0.001 и 0.0003; шаг </w:t>
+      </w:r>
+      <w:proofErr w:type="spellStart"/>
+      <w:r>
+        <w:rPr>
+          <w:sz w:val="28"/>
+        </w:rPr>
+        <w:t>backbone</w:t>
+      </w:r>
+      <w:proofErr w:type="spellEnd"/>
+      <w:r>
+        <w:rPr>
+          <w:sz w:val="28"/>
+        </w:rPr>
+        <w:t xml:space="preserve"> равен </w:t>
+      </w:r>
+      <w:proofErr w:type="spellStart"/>
+      <w:r>
+        <w:rPr>
+          <w:sz w:val="28"/>
+        </w:rPr>
+        <w:t>head</w:t>
+      </w:r>
+      <w:proofErr w:type="spellEnd"/>
+      <w:r>
+        <w:rPr>
+          <w:sz w:val="28"/>
+        </w:rPr>
+        <w:t xml:space="preserve">/10. Для каждого запуска: 6 эпох, </w:t>
+      </w:r>
+      <w:proofErr w:type="spellStart"/>
+      <w:r>
+        <w:rPr>
+          <w:sz w:val="28"/>
+        </w:rPr>
+        <w:t>batch</w:t>
+      </w:r>
+      <w:proofErr w:type="spellEnd"/>
+      <w:r>
+        <w:rPr>
+          <w:sz w:val="28"/>
+        </w:rPr>
+        <w:t xml:space="preserve"> = 8, </w:t>
+      </w:r>
+      <w:proofErr w:type="spellStart"/>
+      <w:r>
+        <w:rPr>
+          <w:sz w:val="28"/>
+        </w:rPr>
+        <w:t>AdamW</w:t>
+      </w:r>
+      <w:proofErr w:type="spellEnd"/>
+      <w:r>
+        <w:rPr>
+          <w:sz w:val="28"/>
+        </w:rPr>
+        <w:t xml:space="preserve">, </w:t>
+      </w:r>
+      <w:proofErr w:type="spellStart"/>
+      <w:r>
+        <w:rPr>
+          <w:sz w:val="28"/>
+        </w:rPr>
+        <w:t>weight</w:t>
+      </w:r>
+      <w:proofErr w:type="spellEnd"/>
+      <w:r>
+        <w:rPr>
+          <w:sz w:val="28"/>
+        </w:rPr>
+        <w:t xml:space="preserve"> </w:t>
+      </w:r>
+      <w:proofErr w:type="spellStart"/>
+      <w:r>
+        <w:rPr>
+          <w:sz w:val="28"/>
+        </w:rPr>
+        <w:t>decay</w:t>
+      </w:r>
+      <w:proofErr w:type="spellEnd"/>
+      <w:r>
+        <w:rPr>
+          <w:sz w:val="28"/>
+        </w:rPr>
+        <w:t xml:space="preserve"> = 0.0001, </w:t>
+      </w:r>
+      <w:proofErr w:type="spellStart"/>
+      <w:r>
+        <w:rPr>
+          <w:sz w:val="28"/>
+        </w:rPr>
+        <w:t>freeze_epochs</w:t>
+      </w:r>
+      <w:proofErr w:type="spellEnd"/>
+      <w:r>
+        <w:rPr>
+          <w:sz w:val="28"/>
+        </w:rPr>
+        <w:t xml:space="preserve"> = 2. Небольшой бюджет выбран для CPU; результаты не описывают сходимость при произвольно долгом обучении.</w:t>
       </w:r>
     </w:p>
     <w:tbl>
       <w:tblPr>
-        <w:tblW w:type="auto" w:w="0"/>
+        <w:tblW w:w="0" w:type="auto"/>
+        <w:tblBorders>
+          <w:top w:val="single" w:sz="4" w:space="0" w:color="808080"/>
+          <w:left w:val="single" w:sz="4" w:space="0" w:color="808080"/>
+          <w:bottom w:val="single" w:sz="4" w:space="0" w:color="808080"/>
+          <w:right w:val="single" w:sz="4" w:space="0" w:color="808080"/>
+          <w:insideH w:val="single" w:sz="4" w:space="0" w:color="808080"/>
+          <w:insideV w:val="single" w:sz="4" w:space="0" w:color="808080"/>
+        </w:tblBorders>
         <w:tblLayout w:type="fixed"/>
-        <w:tblLook w:firstColumn="1" w:firstRow="1" w:lastColumn="0" w:lastRow="0" w:noHBand="0" w:noVBand="1" w:val="04A0"/>
-        <w:tblBorders>
-          <w:top w:val="single" w:sz="4" w:color="808080"/>
-          <w:left w:val="single" w:sz="4" w:color="808080"/>
-          <w:bottom w:val="single" w:sz="4" w:color="808080"/>
-          <w:right w:val="single" w:sz="4" w:color="808080"/>
-          <w:insideH w:val="single" w:sz="4" w:color="808080"/>
-          <w:insideV w:val="single" w:sz="4" w:color="808080"/>
-        </w:tblBorders>
+        <w:tblLook w:val="04A0" w:firstRow="1" w:lastRow="0" w:firstColumn="1" w:lastColumn="0" w:noHBand="0" w:noVBand="1"/>
       </w:tblPr>
       <w:tblGrid>
         <w:gridCol w:w="1938"/>
@@ -1385,16 +2121,15 @@
         </w:trPr>
         <w:tc>
           <w:tcPr>
-            <w:tcW w:type="dxa" w:w="1938"/>
+            <w:tcW w:w="1938" w:type="dxa"/>
           </w:tcPr>
           <w:p>
             <w:pPr>
-              <w:spacing w:line="240" w:lineRule="auto" w:after="80" w:before="80"/>
+              <w:spacing w:before="80" w:after="80"/>
               <w:jc w:val="center"/>
             </w:pPr>
             <w:r>
               <w:rPr>
-                <w:rFonts w:ascii="Times New Roman" w:hAnsi="Times New Roman"/>
                 <w:b/>
                 <w:sz w:val="24"/>
               </w:rPr>
@@ -1404,16 +2139,15 @@
         </w:tc>
         <w:tc>
           <w:tcPr>
-            <w:tcW w:type="dxa" w:w="1938"/>
+            <w:tcW w:w="1938" w:type="dxa"/>
           </w:tcPr>
           <w:p>
             <w:pPr>
-              <w:spacing w:line="240" w:lineRule="auto" w:after="80" w:before="80"/>
+              <w:spacing w:before="80" w:after="80"/>
               <w:jc w:val="center"/>
             </w:pPr>
             <w:r>
               <w:rPr>
-                <w:rFonts w:ascii="Times New Roman" w:hAnsi="Times New Roman"/>
                 <w:b/>
                 <w:sz w:val="24"/>
               </w:rPr>
@@ -1423,16 +2157,15 @@
         </w:tc>
         <w:tc>
           <w:tcPr>
-            <w:tcW w:type="dxa" w:w="1938"/>
+            <w:tcW w:w="1938" w:type="dxa"/>
           </w:tcPr>
           <w:p>
             <w:pPr>
-              <w:spacing w:line="240" w:lineRule="auto" w:after="80" w:before="80"/>
+              <w:spacing w:before="80" w:after="80"/>
               <w:jc w:val="center"/>
             </w:pPr>
             <w:r>
               <w:rPr>
-                <w:rFonts w:ascii="Times New Roman" w:hAnsi="Times New Roman"/>
                 <w:b/>
                 <w:sz w:val="24"/>
               </w:rPr>
@@ -1442,40 +2175,74 @@
         </w:tc>
         <w:tc>
           <w:tcPr>
-            <w:tcW w:type="dxa" w:w="1938"/>
+            <w:tcW w:w="1938" w:type="dxa"/>
           </w:tcPr>
           <w:p>
             <w:pPr>
-              <w:spacing w:line="240" w:lineRule="auto" w:after="80" w:before="80"/>
+              <w:spacing w:before="80" w:after="80"/>
               <w:jc w:val="center"/>
             </w:pPr>
-            <w:r>
-              <w:rPr>
-                <w:rFonts w:ascii="Times New Roman" w:hAnsi="Times New Roman"/>
+            <w:proofErr w:type="spellStart"/>
+            <w:r>
+              <w:rPr>
                 <w:b/>
                 <w:sz w:val="24"/>
               </w:rPr>
-              <w:t>Val acc</w:t>
-            </w:r>
+              <w:t>Val</w:t>
+            </w:r>
+            <w:proofErr w:type="spellEnd"/>
+            <w:r>
+              <w:rPr>
+                <w:b/>
+                <w:sz w:val="24"/>
+              </w:rPr>
+              <w:t xml:space="preserve"> </w:t>
+            </w:r>
+            <w:proofErr w:type="spellStart"/>
+            <w:r>
+              <w:rPr>
+                <w:b/>
+                <w:sz w:val="24"/>
+              </w:rPr>
+              <w:t>acc</w:t>
+            </w:r>
+            <w:proofErr w:type="spellEnd"/>
           </w:p>
         </w:tc>
         <w:tc>
           <w:tcPr>
-            <w:tcW w:type="dxa" w:w="1938"/>
+            <w:tcW w:w="1938" w:type="dxa"/>
           </w:tcPr>
           <w:p>
             <w:pPr>
-              <w:spacing w:line="240" w:lineRule="auto" w:after="80" w:before="80"/>
+              <w:spacing w:before="80" w:after="80"/>
               <w:jc w:val="center"/>
             </w:pPr>
-            <w:r>
-              <w:rPr>
-                <w:rFonts w:ascii="Times New Roman" w:hAnsi="Times New Roman"/>
+            <w:proofErr w:type="spellStart"/>
+            <w:r>
+              <w:rPr>
                 <w:b/>
                 <w:sz w:val="24"/>
               </w:rPr>
-              <w:t>Val loss</w:t>
-            </w:r>
+              <w:t>Val</w:t>
+            </w:r>
+            <w:proofErr w:type="spellEnd"/>
+            <w:r>
+              <w:rPr>
+                <w:b/>
+                <w:sz w:val="24"/>
+              </w:rPr>
+              <w:t xml:space="preserve"> </w:t>
+            </w:r>
+            <w:proofErr w:type="spellStart"/>
+            <w:r>
+              <w:rPr>
+                <w:b/>
+                <w:sz w:val="24"/>
+              </w:rPr>
+              <w:t>loss</w:t>
+            </w:r>
+            <w:proofErr w:type="spellEnd"/>
           </w:p>
         </w:tc>
       </w:tr>
@@ -1485,17 +2252,15 @@
         </w:trPr>
         <w:tc>
           <w:tcPr>
-            <w:tcW w:type="dxa" w:w="1938"/>
+            <w:tcW w:w="1938" w:type="dxa"/>
           </w:tcPr>
           <w:p>
             <w:pPr>
-              <w:spacing w:line="240" w:lineRule="auto" w:after="80" w:before="80"/>
+              <w:spacing w:before="80" w:after="80"/>
               <w:jc w:val="center"/>
             </w:pPr>
             <w:r>
               <w:rPr>
-                <w:rFonts w:ascii="Times New Roman" w:hAnsi="Times New Roman"/>
-                <w:b w:val="0"/>
                 <w:sz w:val="24"/>
               </w:rPr>
               <w:t>ResNet18</w:t>
@@ -1504,17 +2269,15 @@
         </w:tc>
         <w:tc>
           <w:tcPr>
-            <w:tcW w:type="dxa" w:w="1938"/>
+            <w:tcW w:w="1938" w:type="dxa"/>
           </w:tcPr>
           <w:p>
             <w:pPr>
-              <w:spacing w:line="240" w:lineRule="auto" w:after="80" w:before="80"/>
+              <w:spacing w:before="80" w:after="80"/>
               <w:jc w:val="center"/>
             </w:pPr>
             <w:r>
               <w:rPr>
-                <w:rFonts w:ascii="Times New Roman" w:hAnsi="Times New Roman"/>
-                <w:b w:val="0"/>
                 <w:sz w:val="24"/>
               </w:rPr>
               <w:t>0.001</w:t>
@@ -1523,17 +2286,15 @@
         </w:tc>
         <w:tc>
           <w:tcPr>
-            <w:tcW w:type="dxa" w:w="1938"/>
+            <w:tcW w:w="1938" w:type="dxa"/>
           </w:tcPr>
           <w:p>
             <w:pPr>
-              <w:spacing w:line="240" w:lineRule="auto" w:after="80" w:before="80"/>
+              <w:spacing w:before="80" w:after="80"/>
               <w:jc w:val="center"/>
             </w:pPr>
             <w:r>
               <w:rPr>
-                <w:rFonts w:ascii="Times New Roman" w:hAnsi="Times New Roman"/>
-                <w:b w:val="0"/>
                 <w:sz w:val="24"/>
               </w:rPr>
               <w:t>2</w:t>
@@ -1542,17 +2303,15 @@
         </w:tc>
         <w:tc>
           <w:tcPr>
-            <w:tcW w:type="dxa" w:w="1938"/>
+            <w:tcW w:w="1938" w:type="dxa"/>
           </w:tcPr>
           <w:p>
             <w:pPr>
-              <w:spacing w:line="240" w:lineRule="auto" w:after="80" w:before="80"/>
+              <w:spacing w:before="80" w:after="80"/>
               <w:jc w:val="center"/>
             </w:pPr>
             <w:r>
               <w:rPr>
-                <w:rFonts w:ascii="Times New Roman" w:hAnsi="Times New Roman"/>
-                <w:b w:val="0"/>
                 <w:sz w:val="24"/>
               </w:rPr>
               <w:t>1.0000</w:t>
@@ -1561,17 +2320,15 @@
         </w:tc>
         <w:tc>
           <w:tcPr>
-            <w:tcW w:type="dxa" w:w="1938"/>
+            <w:tcW w:w="1938" w:type="dxa"/>
           </w:tcPr>
           <w:p>
             <w:pPr>
-              <w:spacing w:line="240" w:lineRule="auto" w:after="80" w:before="80"/>
+              <w:spacing w:before="80" w:after="80"/>
               <w:jc w:val="center"/>
             </w:pPr>
             <w:r>
               <w:rPr>
-                <w:rFonts w:ascii="Times New Roman" w:hAnsi="Times New Roman"/>
-                <w:b w:val="0"/>
                 <w:sz w:val="24"/>
               </w:rPr>
               <w:t>0.6267</w:t>
@@ -1585,17 +2342,15 @@
         </w:trPr>
         <w:tc>
           <w:tcPr>
-            <w:tcW w:type="dxa" w:w="1938"/>
+            <w:tcW w:w="1938" w:type="dxa"/>
           </w:tcPr>
           <w:p>
             <w:pPr>
-              <w:spacing w:line="240" w:lineRule="auto" w:after="80" w:before="80"/>
+              <w:spacing w:before="80" w:after="80"/>
               <w:jc w:val="center"/>
             </w:pPr>
             <w:r>
               <w:rPr>
-                <w:rFonts w:ascii="Times New Roman" w:hAnsi="Times New Roman"/>
-                <w:b w:val="0"/>
                 <w:sz w:val="24"/>
               </w:rPr>
               <w:t>ResNet18</w:t>
@@ -1604,17 +2359,15 @@
         </w:tc>
         <w:tc>
           <w:tcPr>
-            <w:tcW w:type="dxa" w:w="1938"/>
+            <w:tcW w:w="1938" w:type="dxa"/>
           </w:tcPr>
           <w:p>
             <w:pPr>
-              <w:spacing w:line="240" w:lineRule="auto" w:after="80" w:before="80"/>
+              <w:spacing w:before="80" w:after="80"/>
               <w:jc w:val="center"/>
             </w:pPr>
             <w:r>
               <w:rPr>
-                <w:rFonts w:ascii="Times New Roman" w:hAnsi="Times New Roman"/>
-                <w:b w:val="0"/>
                 <w:sz w:val="24"/>
               </w:rPr>
               <w:t>0.0003</w:t>
@@ -1623,17 +2376,15 @@
         </w:tc>
         <w:tc>
           <w:tcPr>
-            <w:tcW w:type="dxa" w:w="1938"/>
+            <w:tcW w:w="1938" w:type="dxa"/>
           </w:tcPr>
           <w:p>
             <w:pPr>
-              <w:spacing w:line="240" w:lineRule="auto" w:after="80" w:before="80"/>
+              <w:spacing w:before="80" w:after="80"/>
               <w:jc w:val="center"/>
             </w:pPr>
             <w:r>
               <w:rPr>
-                <w:rFonts w:ascii="Times New Roman" w:hAnsi="Times New Roman"/>
-                <w:b w:val="0"/>
                 <w:sz w:val="24"/>
               </w:rPr>
               <w:t>2</w:t>
@@ -1642,17 +2393,15 @@
         </w:tc>
         <w:tc>
           <w:tcPr>
-            <w:tcW w:type="dxa" w:w="1938"/>
+            <w:tcW w:w="1938" w:type="dxa"/>
           </w:tcPr>
           <w:p>
             <w:pPr>
-              <w:spacing w:line="240" w:lineRule="auto" w:after="80" w:before="80"/>
+              <w:spacing w:before="80" w:after="80"/>
               <w:jc w:val="center"/>
             </w:pPr>
             <w:r>
               <w:rPr>
-                <w:rFonts w:ascii="Times New Roman" w:hAnsi="Times New Roman"/>
-                <w:b w:val="0"/>
                 <w:sz w:val="24"/>
               </w:rPr>
               <w:t>0.8182</w:t>
@@ -1661,17 +2410,15 @@
         </w:tc>
         <w:tc>
           <w:tcPr>
-            <w:tcW w:type="dxa" w:w="1938"/>
+            <w:tcW w:w="1938" w:type="dxa"/>
           </w:tcPr>
           <w:p>
             <w:pPr>
-              <w:spacing w:line="240" w:lineRule="auto" w:after="80" w:before="80"/>
+              <w:spacing w:before="80" w:after="80"/>
               <w:jc w:val="center"/>
             </w:pPr>
             <w:r>
               <w:rPr>
-                <w:rFonts w:ascii="Times New Roman" w:hAnsi="Times New Roman"/>
-                <w:b w:val="0"/>
                 <w:sz w:val="24"/>
               </w:rPr>
               <w:t>0.9515</w:t>
@@ -1685,17 +2432,15 @@
         </w:trPr>
         <w:tc>
           <w:tcPr>
-            <w:tcW w:type="dxa" w:w="1938"/>
+            <w:tcW w:w="1938" w:type="dxa"/>
           </w:tcPr>
           <w:p>
             <w:pPr>
-              <w:spacing w:line="240" w:lineRule="auto" w:after="80" w:before="80"/>
+              <w:spacing w:before="80" w:after="80"/>
               <w:jc w:val="center"/>
             </w:pPr>
             <w:r>
               <w:rPr>
-                <w:rFonts w:ascii="Times New Roman" w:hAnsi="Times New Roman"/>
-                <w:b w:val="0"/>
                 <w:sz w:val="24"/>
               </w:rPr>
               <w:t>MobileNetV3</w:t>
@@ -1704,17 +2449,15 @@
         </w:tc>
         <w:tc>
           <w:tcPr>
-            <w:tcW w:type="dxa" w:w="1938"/>
+            <w:tcW w:w="1938" w:type="dxa"/>
           </w:tcPr>
           <w:p>
             <w:pPr>
-              <w:spacing w:line="240" w:lineRule="auto" w:after="80" w:before="80"/>
+              <w:spacing w:before="80" w:after="80"/>
               <w:jc w:val="center"/>
             </w:pPr>
             <w:r>
               <w:rPr>
-                <w:rFonts w:ascii="Times New Roman" w:hAnsi="Times New Roman"/>
-                <w:b w:val="0"/>
                 <w:sz w:val="24"/>
               </w:rPr>
               <w:t>0.001</w:t>
@@ -1723,17 +2466,15 @@
         </w:tc>
         <w:tc>
           <w:tcPr>
-            <w:tcW w:type="dxa" w:w="1938"/>
+            <w:tcW w:w="1938" w:type="dxa"/>
           </w:tcPr>
           <w:p>
             <w:pPr>
-              <w:spacing w:line="240" w:lineRule="auto" w:after="80" w:before="80"/>
+              <w:spacing w:before="80" w:after="80"/>
               <w:jc w:val="center"/>
             </w:pPr>
             <w:r>
               <w:rPr>
-                <w:rFonts w:ascii="Times New Roman" w:hAnsi="Times New Roman"/>
-                <w:b w:val="0"/>
                 <w:sz w:val="24"/>
               </w:rPr>
               <w:t>4</w:t>
@@ -1742,17 +2483,15 @@
         </w:tc>
         <w:tc>
           <w:tcPr>
-            <w:tcW w:type="dxa" w:w="1938"/>
+            <w:tcW w:w="1938" w:type="dxa"/>
           </w:tcPr>
           <w:p>
             <w:pPr>
-              <w:spacing w:line="240" w:lineRule="auto" w:after="80" w:before="80"/>
+              <w:spacing w:before="80" w:after="80"/>
               <w:jc w:val="center"/>
             </w:pPr>
             <w:r>
               <w:rPr>
-                <w:rFonts w:ascii="Times New Roman" w:hAnsi="Times New Roman"/>
-                <w:b w:val="0"/>
                 <w:sz w:val="24"/>
               </w:rPr>
               <w:t>0.8636</w:t>
@@ -1761,17 +2500,15 @@
         </w:tc>
         <w:tc>
           <w:tcPr>
-            <w:tcW w:type="dxa" w:w="1938"/>
+            <w:tcW w:w="1938" w:type="dxa"/>
           </w:tcPr>
           <w:p>
             <w:pPr>
-              <w:spacing w:line="240" w:lineRule="auto" w:after="80" w:before="80"/>
+              <w:spacing w:before="80" w:after="80"/>
               <w:jc w:val="center"/>
             </w:pPr>
             <w:r>
               <w:rPr>
-                <w:rFonts w:ascii="Times New Roman" w:hAnsi="Times New Roman"/>
-                <w:b w:val="0"/>
                 <w:sz w:val="24"/>
               </w:rPr>
               <w:t>0.4337</w:t>
@@ -1785,17 +2522,15 @@
         </w:trPr>
         <w:tc>
           <w:tcPr>
-            <w:tcW w:type="dxa" w:w="1938"/>
+            <w:tcW w:w="1938" w:type="dxa"/>
           </w:tcPr>
           <w:p>
             <w:pPr>
-              <w:spacing w:line="240" w:lineRule="auto" w:after="80" w:before="80"/>
+              <w:spacing w:before="80" w:after="80"/>
               <w:jc w:val="center"/>
             </w:pPr>
             <w:r>
               <w:rPr>
-                <w:rFonts w:ascii="Times New Roman" w:hAnsi="Times New Roman"/>
-                <w:b w:val="0"/>
                 <w:sz w:val="24"/>
               </w:rPr>
               <w:t>MobileNetV3</w:t>
@@ -1804,17 +2539,15 @@
         </w:tc>
         <w:tc>
           <w:tcPr>
-            <w:tcW w:type="dxa" w:w="1938"/>
+            <w:tcW w:w="1938" w:type="dxa"/>
           </w:tcPr>
           <w:p>
             <w:pPr>
-              <w:spacing w:line="240" w:lineRule="auto" w:after="80" w:before="80"/>
+              <w:spacing w:before="80" w:after="80"/>
               <w:jc w:val="center"/>
             </w:pPr>
             <w:r>
               <w:rPr>
-                <w:rFonts w:ascii="Times New Roman" w:hAnsi="Times New Roman"/>
-                <w:b w:val="0"/>
                 <w:sz w:val="24"/>
               </w:rPr>
               <w:t>0.0003</w:t>
@@ -1823,17 +2556,15 @@
         </w:tc>
         <w:tc>
           <w:tcPr>
-            <w:tcW w:type="dxa" w:w="1938"/>
+            <w:tcW w:w="1938" w:type="dxa"/>
           </w:tcPr>
           <w:p>
             <w:pPr>
-              <w:spacing w:line="240" w:lineRule="auto" w:after="80" w:before="80"/>
+              <w:spacing w:before="80" w:after="80"/>
               <w:jc w:val="center"/>
             </w:pPr>
             <w:r>
               <w:rPr>
-                <w:rFonts w:ascii="Times New Roman" w:hAnsi="Times New Roman"/>
-                <w:b w:val="0"/>
                 <w:sz w:val="24"/>
               </w:rPr>
               <w:t>6</w:t>
@@ -1842,17 +2573,15 @@
         </w:tc>
         <w:tc>
           <w:tcPr>
-            <w:tcW w:type="dxa" w:w="1938"/>
+            <w:tcW w:w="1938" w:type="dxa"/>
           </w:tcPr>
           <w:p>
             <w:pPr>
-              <w:spacing w:line="240" w:lineRule="auto" w:after="80" w:before="80"/>
+              <w:spacing w:before="80" w:after="80"/>
               <w:jc w:val="center"/>
             </w:pPr>
             <w:r>
               <w:rPr>
-                <w:rFonts w:ascii="Times New Roman" w:hAnsi="Times New Roman"/>
-                <w:b w:val="0"/>
                 <w:sz w:val="24"/>
               </w:rPr>
               <w:t>0.7273</w:t>
@@ -1861,17 +2590,15 @@
         </w:tc>
         <w:tc>
           <w:tcPr>
-            <w:tcW w:type="dxa" w:w="1938"/>
+            <w:tcW w:w="1938" w:type="dxa"/>
           </w:tcPr>
           <w:p>
             <w:pPr>
-              <w:spacing w:line="240" w:lineRule="auto" w:after="80" w:before="80"/>
+              <w:spacing w:before="80" w:after="80"/>
               <w:jc w:val="center"/>
             </w:pPr>
             <w:r>
               <w:rPr>
-                <w:rFonts w:ascii="Times New Roman" w:hAnsi="Times New Roman"/>
-                <w:b w:val="0"/>
                 <w:sz w:val="24"/>
               </w:rPr>
               <w:t>1.3771</w:t>
@@ -1883,29 +2610,123 @@
     <w:p>
       <w:pPr>
         <w:widowControl/>
-        <w:spacing w:line="360" w:lineRule="auto" w:after="100" w:before="0"/>
+        <w:spacing w:after="100" w:line="360" w:lineRule="auto"/>
         <w:jc w:val="both"/>
       </w:pPr>
       <w:r>
         <w:rPr>
-          <w:rFonts w:ascii="Times New Roman" w:hAnsi="Times New Roman"/>
-          <w:b w:val="0"/>
-          <w:sz w:val="28"/>
-        </w:rPr>
-        <w:t>Эпоха и запуск выбираются по максимальной validation accuracy, при равенстве — по минимальной validation cross-entropy. Победитель определяется до открытия test. По этому правилу выбрана ResNet18, LR головы 0.001, checkpoint эпохи 2. Вся процедура включала размораживание, однако лучший checkpoint получен на этапе обучения только головы.</w:t>
+          <w:sz w:val="28"/>
+        </w:rPr>
+        <w:t xml:space="preserve">Эпоха и запуск выбираются по максимальной </w:t>
+      </w:r>
+      <w:proofErr w:type="spellStart"/>
+      <w:r>
+        <w:rPr>
+          <w:sz w:val="28"/>
+        </w:rPr>
+        <w:t>validation</w:t>
+      </w:r>
+      <w:proofErr w:type="spellEnd"/>
+      <w:r>
+        <w:rPr>
+          <w:sz w:val="28"/>
+        </w:rPr>
+        <w:t xml:space="preserve"> </w:t>
+      </w:r>
+      <w:proofErr w:type="spellStart"/>
+      <w:r>
+        <w:rPr>
+          <w:sz w:val="28"/>
+        </w:rPr>
+        <w:t>accuracy</w:t>
+      </w:r>
+      <w:proofErr w:type="spellEnd"/>
+      <w:r>
+        <w:rPr>
+          <w:sz w:val="28"/>
+        </w:rPr>
+        <w:t xml:space="preserve">, при равенстве — по минимальной </w:t>
+      </w:r>
+      <w:proofErr w:type="spellStart"/>
+      <w:r>
+        <w:rPr>
+          <w:sz w:val="28"/>
+        </w:rPr>
+        <w:t>validation</w:t>
+      </w:r>
+      <w:proofErr w:type="spellEnd"/>
+      <w:r>
+        <w:rPr>
+          <w:sz w:val="28"/>
+        </w:rPr>
+        <w:t xml:space="preserve"> </w:t>
+      </w:r>
+      <w:proofErr w:type="spellStart"/>
+      <w:r>
+        <w:rPr>
+          <w:sz w:val="28"/>
+        </w:rPr>
+        <w:t>cross-entropy</w:t>
+      </w:r>
+      <w:proofErr w:type="spellEnd"/>
+      <w:r>
+        <w:rPr>
+          <w:sz w:val="28"/>
+        </w:rPr>
+        <w:t xml:space="preserve">. Победитель определяется до открытия </w:t>
+      </w:r>
+      <w:proofErr w:type="spellStart"/>
+      <w:r>
+        <w:rPr>
+          <w:sz w:val="28"/>
+        </w:rPr>
+        <w:t>test</w:t>
+      </w:r>
+      <w:proofErr w:type="spellEnd"/>
+      <w:r>
+        <w:rPr>
+          <w:sz w:val="28"/>
+        </w:rPr>
+        <w:t xml:space="preserve">. По этому правилу выбрана ResNet18, LR головы 0.001, </w:t>
+      </w:r>
+      <w:proofErr w:type="spellStart"/>
+      <w:r>
+        <w:rPr>
+          <w:sz w:val="28"/>
+        </w:rPr>
+        <w:t>checkpoint</w:t>
+      </w:r>
+      <w:proofErr w:type="spellEnd"/>
+      <w:r>
+        <w:rPr>
+          <w:sz w:val="28"/>
+        </w:rPr>
+        <w:t xml:space="preserve"> эпохи 2. Вся процедура включала размораживание, однако лучший </w:t>
+      </w:r>
+      <w:proofErr w:type="spellStart"/>
+      <w:r>
+        <w:rPr>
+          <w:sz w:val="28"/>
+        </w:rPr>
+        <w:t>checkpoint</w:t>
+      </w:r>
+      <w:proofErr w:type="spellEnd"/>
+      <w:r>
+        <w:rPr>
+          <w:sz w:val="28"/>
+        </w:rPr>
+        <w:t xml:space="preserve"> получен на этапе обучения только головы.</w:t>
       </w:r>
     </w:p>
     <w:p>
       <w:pPr>
         <w:keepNext/>
-        <w:pageBreakBefore w:val="0"/>
         <w:widowControl/>
-        <w:spacing w:line="360" w:lineRule="auto" w:after="100" w:before="0"/>
+        <w:spacing w:after="100" w:line="360" w:lineRule="auto"/>
         <w:jc w:val="both"/>
       </w:pPr>
       <w:r>
         <w:rPr>
-          <w:rFonts w:ascii="Times New Roman" w:hAnsi="Times New Roman"/>
           <w:b/>
           <w:sz w:val="28"/>
         </w:rPr>
@@ -1915,44 +2736,173 @@
     <w:p>
       <w:pPr>
         <w:widowControl/>
-        <w:spacing w:line="360" w:lineRule="auto" w:after="100" w:before="0"/>
+        <w:spacing w:after="100" w:line="360" w:lineRule="auto"/>
         <w:jc w:val="both"/>
       </w:pPr>
-      <w:r>
-        <w:rPr>
-          <w:rFonts w:ascii="Times New Roman" w:hAnsi="Times New Roman"/>
-          <w:b w:val="0"/>
-          <w:sz w:val="28"/>
-        </w:rPr>
-        <w:t>TrainConfig — Python dataclass; параметры передаются через JSON и --config. Зафиксированы Python random, NumPy, PyTorch и CUDA seed = 42, включены детерминированные операции, num_workers = 0, два CPU-потока. В requirements.txt зафиксированы версии; полный снимок среды сохранён в requirements-lock.txt.</w:t>
+      <w:proofErr w:type="spellStart"/>
+      <w:r>
+        <w:rPr>
+          <w:sz w:val="28"/>
+        </w:rPr>
+        <w:t>TrainConfig</w:t>
+      </w:r>
+      <w:proofErr w:type="spellEnd"/>
+      <w:r>
+        <w:rPr>
+          <w:sz w:val="28"/>
+        </w:rPr>
+        <w:t xml:space="preserve"> — Python </w:t>
+      </w:r>
+      <w:proofErr w:type="spellStart"/>
+      <w:r>
+        <w:rPr>
+          <w:sz w:val="28"/>
+        </w:rPr>
+        <w:t>dataclass</w:t>
+      </w:r>
+      <w:proofErr w:type="spellEnd"/>
+      <w:r>
+        <w:rPr>
+          <w:sz w:val="28"/>
+        </w:rPr>
+        <w:t>; параметры передаются через JSON и --</w:t>
+      </w:r>
+      <w:proofErr w:type="spellStart"/>
+      <w:r>
+        <w:rPr>
+          <w:sz w:val="28"/>
+        </w:rPr>
+        <w:t>config</w:t>
+      </w:r>
+      <w:proofErr w:type="spellEnd"/>
+      <w:r>
+        <w:rPr>
+          <w:sz w:val="28"/>
+        </w:rPr>
+        <w:t xml:space="preserve">. Зафиксированы Python </w:t>
+      </w:r>
+      <w:proofErr w:type="spellStart"/>
+      <w:r>
+        <w:rPr>
+          <w:sz w:val="28"/>
+        </w:rPr>
+        <w:t>random</w:t>
+      </w:r>
+      <w:proofErr w:type="spellEnd"/>
+      <w:r>
+        <w:rPr>
+          <w:sz w:val="28"/>
+        </w:rPr>
+        <w:t xml:space="preserve">, </w:t>
+      </w:r>
+      <w:proofErr w:type="spellStart"/>
+      <w:r>
+        <w:rPr>
+          <w:sz w:val="28"/>
+        </w:rPr>
+        <w:t>NumPy</w:t>
+      </w:r>
+      <w:proofErr w:type="spellEnd"/>
+      <w:r>
+        <w:rPr>
+          <w:sz w:val="28"/>
+        </w:rPr>
+        <w:t xml:space="preserve">, </w:t>
+      </w:r>
+      <w:proofErr w:type="spellStart"/>
+      <w:r>
+        <w:rPr>
+          <w:sz w:val="28"/>
+        </w:rPr>
+        <w:t>PyTorch</w:t>
+      </w:r>
+      <w:proofErr w:type="spellEnd"/>
+      <w:r>
+        <w:rPr>
+          <w:sz w:val="28"/>
+        </w:rPr>
+        <w:t xml:space="preserve"> и CUDA </w:t>
+      </w:r>
+      <w:proofErr w:type="spellStart"/>
+      <w:r>
+        <w:rPr>
+          <w:sz w:val="28"/>
+        </w:rPr>
+        <w:t>seed</w:t>
+      </w:r>
+      <w:proofErr w:type="spellEnd"/>
+      <w:r>
+        <w:rPr>
+          <w:sz w:val="28"/>
+        </w:rPr>
+        <w:t xml:space="preserve"> = 42, включены детерминированные операции, </w:t>
+      </w:r>
+      <w:proofErr w:type="spellStart"/>
+      <w:r>
+        <w:rPr>
+          <w:sz w:val="28"/>
+        </w:rPr>
+        <w:t>num_workers</w:t>
+      </w:r>
+      <w:proofErr w:type="spellEnd"/>
+      <w:r>
+        <w:rPr>
+          <w:sz w:val="28"/>
+        </w:rPr>
+        <w:t xml:space="preserve"> = 0, два CPU-потока. В requirements.txt зафиксированы версии; полный снимок среды сохранён в requirements-lock.txt.</w:t>
       </w:r>
     </w:p>
     <w:p>
       <w:pPr>
         <w:widowControl/>
-        <w:spacing w:line="360" w:lineRule="auto" w:after="100" w:before="0"/>
+        <w:spacing w:after="100" w:line="360" w:lineRule="auto"/>
         <w:jc w:val="both"/>
       </w:pPr>
       <w:r>
         <w:rPr>
-          <w:rFonts w:ascii="Times New Roman" w:hAnsi="Times New Roman"/>
-          <w:b w:val="0"/>
-          <w:sz w:val="28"/>
-        </w:rPr>
-        <w:t>Лучший запуск повторён с тем же seed. Все значения истории и все тензоры checkpoint совпали точно. Это подтверждает воспроизводимость на данной машине и в зафиксированном окружении; одинаковые результаты на любых версиях библиотек и процессорах не гарантируются.</w:t>
+          <w:sz w:val="28"/>
+        </w:rPr>
+        <w:lastRenderedPageBreak/>
+        <w:t xml:space="preserve">Лучший запуск повторён с тем же </w:t>
+      </w:r>
+      <w:proofErr w:type="spellStart"/>
+      <w:r>
+        <w:rPr>
+          <w:sz w:val="28"/>
+        </w:rPr>
+        <w:t>seed</w:t>
+      </w:r>
+      <w:proofErr w:type="spellEnd"/>
+      <w:r>
+        <w:rPr>
+          <w:sz w:val="28"/>
+        </w:rPr>
+        <w:t xml:space="preserve">. Все значения истории и все тензоры </w:t>
+      </w:r>
+      <w:proofErr w:type="spellStart"/>
+      <w:r>
+        <w:rPr>
+          <w:sz w:val="28"/>
+        </w:rPr>
+        <w:t>checkpoint</w:t>
+      </w:r>
+      <w:proofErr w:type="spellEnd"/>
+      <w:r>
+        <w:rPr>
+          <w:sz w:val="28"/>
+        </w:rPr>
+        <w:t xml:space="preserve"> совпали точно. Это подтверждает воспроизводимость на данной машине и в зафиксированном окружении; одинаковые результаты на любых версиях библиотек и процессорах не гарантируются.</w:t>
       </w:r>
     </w:p>
     <w:p>
       <w:pPr>
         <w:keepNext/>
-        <w:pageBreakBefore w:val="0"/>
         <w:widowControl/>
-        <w:spacing w:line="360" w:lineRule="auto" w:after="100" w:before="0"/>
+        <w:spacing w:after="100" w:line="360" w:lineRule="auto"/>
         <w:jc w:val="both"/>
       </w:pPr>
       <w:r>
         <w:rPr>
-          <w:rFonts w:ascii="Times New Roman" w:hAnsi="Times New Roman"/>
           <w:b/>
           <w:sz w:val="28"/>
         </w:rPr>
@@ -1962,26 +2912,29 @@
     <w:p>
       <w:pPr>
         <w:keepNext/>
-        <w:spacing w:after="0"/>
         <w:jc w:val="center"/>
       </w:pPr>
       <w:r>
+        <w:rPr>
+          <w:noProof/>
+        </w:rPr>
         <w:drawing>
-          <wp:inline xmlns:a="http://schemas.openxmlformats.org/drawingml/2006/main" xmlns:pic="http://schemas.openxmlformats.org/drawingml/2006/picture">
+          <wp:inline distT="0" distB="0" distL="0" distR="0" wp14:anchorId="2F4D986F" wp14:editId="4EDD98D0">
             <wp:extent cx="5760000" cy="2073600"/>
+            <wp:effectExtent l="0" t="0" r="0" b="0"/>
             <wp:docPr id="2" name="Picture 2" descr="Рисунок 2 — ResNet18 с шагом головы 0.001"/>
             <wp:cNvGraphicFramePr>
-              <a:graphicFrameLocks noChangeAspect="1"/>
+              <a:graphicFrameLocks xmlns:a="http://schemas.openxmlformats.org/drawingml/2006/main" noChangeAspect="1"/>
             </wp:cNvGraphicFramePr>
-            <a:graphic>
+            <a:graphic xmlns:a="http://schemas.openxmlformats.org/drawingml/2006/main">
               <a:graphicData uri="http://schemas.openxmlformats.org/drawingml/2006/picture">
-                <pic:pic>
+                <pic:pic xmlns:pic="http://schemas.openxmlformats.org/drawingml/2006/picture">
                   <pic:nvPicPr>
                     <pic:cNvPr id="0" name="resnet18_lr001.png"/>
                     <pic:cNvPicPr/>
                   </pic:nvPicPr>
                   <pic:blipFill>
-                    <a:blip r:embed="rId14"/>
+                    <a:blip r:embed="rId8"/>
                     <a:stretch>
                       <a:fillRect/>
                     </a:stretch>
@@ -1991,7 +2944,9 @@
                       <a:off x="0" y="0"/>
                       <a:ext cx="5760000" cy="2073600"/>
                     </a:xfrm>
-                    <a:prstGeom prst="rect"/>
+                    <a:prstGeom prst="rect">
+                      <a:avLst/>
+                    </a:prstGeom>
                   </pic:spPr>
                 </pic:pic>
               </a:graphicData>
@@ -2003,13 +2958,11 @@
     <w:p>
       <w:pPr>
         <w:widowControl/>
-        <w:spacing w:line="240" w:lineRule="auto" w:after="100" w:before="0"/>
+        <w:spacing w:after="100"/>
         <w:jc w:val="center"/>
       </w:pPr>
       <w:r>
         <w:rPr>
-          <w:rFonts w:ascii="Times New Roman" w:hAnsi="Times New Roman"/>
-          <w:b w:val="0"/>
           <w:sz w:val="24"/>
         </w:rPr>
         <w:t>Рисунок 2 — ResNet18 с шагом головы 0.001</w:t>
@@ -2018,41 +2971,182 @@
     <w:p>
       <w:pPr>
         <w:widowControl/>
-        <w:spacing w:line="360" w:lineRule="auto" w:after="100" w:before="0"/>
+        <w:spacing w:after="100" w:line="360" w:lineRule="auto"/>
         <w:jc w:val="both"/>
       </w:pPr>
       <w:r>
         <w:rPr>
-          <w:rFonts w:ascii="Times New Roman" w:hAnsi="Times New Roman"/>
-          <w:b w:val="0"/>
-          <w:sz w:val="28"/>
-        </w:rPr>
-        <w:t>ResNet18 достигает 22/22 на validation на эпохе 2. После размораживания accuracy составляет 21/22; loss к эпохе 6 уменьшается до 0.5580. Accuracy и loss оценивают разные свойства, поэтому меньшая loss не обязательно означает больше правильных argmax. Падение train accuracy на эпохе 3 совпадает со сменой режима BatchNorm и набора обучаемых весов.</w:t>
+          <w:sz w:val="28"/>
+        </w:rPr>
+        <w:t xml:space="preserve">ResNet18 достигает 22/22 на </w:t>
+      </w:r>
+      <w:proofErr w:type="spellStart"/>
+      <w:r>
+        <w:rPr>
+          <w:sz w:val="28"/>
+        </w:rPr>
+        <w:t>validation</w:t>
+      </w:r>
+      <w:proofErr w:type="spellEnd"/>
+      <w:r>
+        <w:rPr>
+          <w:sz w:val="28"/>
+        </w:rPr>
+        <w:t xml:space="preserve"> на эпохе 2. После размораживания </w:t>
+      </w:r>
+      <w:proofErr w:type="spellStart"/>
+      <w:r>
+        <w:rPr>
+          <w:sz w:val="28"/>
+        </w:rPr>
+        <w:t>accuracy</w:t>
+      </w:r>
+      <w:proofErr w:type="spellEnd"/>
+      <w:r>
+        <w:rPr>
+          <w:sz w:val="28"/>
+        </w:rPr>
+        <w:t xml:space="preserve"> составляет 21/22; </w:t>
+      </w:r>
+      <w:proofErr w:type="spellStart"/>
+      <w:r>
+        <w:rPr>
+          <w:sz w:val="28"/>
+        </w:rPr>
+        <w:t>loss</w:t>
+      </w:r>
+      <w:proofErr w:type="spellEnd"/>
+      <w:r>
+        <w:rPr>
+          <w:sz w:val="28"/>
+        </w:rPr>
+        <w:t xml:space="preserve"> к эпохе 6 уменьшается до 0.5580. </w:t>
+      </w:r>
+      <w:proofErr w:type="spellStart"/>
+      <w:r>
+        <w:rPr>
+          <w:sz w:val="28"/>
+        </w:rPr>
+        <w:t>Accuracy</w:t>
+      </w:r>
+      <w:proofErr w:type="spellEnd"/>
+      <w:r>
+        <w:rPr>
+          <w:sz w:val="28"/>
+        </w:rPr>
+        <w:t xml:space="preserve"> и </w:t>
+      </w:r>
+      <w:proofErr w:type="spellStart"/>
+      <w:r>
+        <w:rPr>
+          <w:sz w:val="28"/>
+        </w:rPr>
+        <w:t>loss</w:t>
+      </w:r>
+      <w:proofErr w:type="spellEnd"/>
+      <w:r>
+        <w:rPr>
+          <w:sz w:val="28"/>
+        </w:rPr>
+        <w:t xml:space="preserve"> оценивают разные свойства, поэтому меньшая </w:t>
+      </w:r>
+      <w:proofErr w:type="spellStart"/>
+      <w:r>
+        <w:rPr>
+          <w:sz w:val="28"/>
+        </w:rPr>
+        <w:t>loss</w:t>
+      </w:r>
+      <w:proofErr w:type="spellEnd"/>
+      <w:r>
+        <w:rPr>
+          <w:sz w:val="28"/>
+        </w:rPr>
+        <w:t xml:space="preserve"> не обязательно означает больше правильных </w:t>
+      </w:r>
+      <w:proofErr w:type="spellStart"/>
+      <w:r>
+        <w:rPr>
+          <w:sz w:val="28"/>
+        </w:rPr>
+        <w:t>argmax</w:t>
+      </w:r>
+      <w:proofErr w:type="spellEnd"/>
+      <w:r>
+        <w:rPr>
+          <w:sz w:val="28"/>
+        </w:rPr>
+        <w:t xml:space="preserve">. Падение </w:t>
+      </w:r>
+      <w:proofErr w:type="spellStart"/>
+      <w:r>
+        <w:rPr>
+          <w:sz w:val="28"/>
+        </w:rPr>
+        <w:t>train</w:t>
+      </w:r>
+      <w:proofErr w:type="spellEnd"/>
+      <w:r>
+        <w:rPr>
+          <w:sz w:val="28"/>
+        </w:rPr>
+        <w:t xml:space="preserve"> </w:t>
+      </w:r>
+      <w:proofErr w:type="spellStart"/>
+      <w:r>
+        <w:rPr>
+          <w:sz w:val="28"/>
+        </w:rPr>
+        <w:t>accuracy</w:t>
+      </w:r>
+      <w:proofErr w:type="spellEnd"/>
+      <w:r>
+        <w:rPr>
+          <w:sz w:val="28"/>
+        </w:rPr>
+        <w:t xml:space="preserve"> на эпохе 3 совпадает со сменой режима </w:t>
+      </w:r>
+      <w:proofErr w:type="spellStart"/>
+      <w:r>
+        <w:rPr>
+          <w:sz w:val="28"/>
+        </w:rPr>
+        <w:t>BatchNorm</w:t>
+      </w:r>
+      <w:proofErr w:type="spellEnd"/>
+      <w:r>
+        <w:rPr>
+          <w:sz w:val="28"/>
+        </w:rPr>
+        <w:t xml:space="preserve"> и набора обучаемых весов.</w:t>
       </w:r>
     </w:p>
     <w:p>
       <w:pPr>
         <w:keepNext/>
-        <w:spacing w:after="0"/>
         <w:jc w:val="center"/>
       </w:pPr>
       <w:r>
+        <w:rPr>
+          <w:noProof/>
+        </w:rPr>
         <w:drawing>
-          <wp:inline xmlns:a="http://schemas.openxmlformats.org/drawingml/2006/main" xmlns:pic="http://schemas.openxmlformats.org/drawingml/2006/picture">
+          <wp:inline distT="0" distB="0" distL="0" distR="0" wp14:anchorId="263C5023" wp14:editId="72DB09C1">
             <wp:extent cx="5760000" cy="2073600"/>
+            <wp:effectExtent l="0" t="0" r="0" b="0"/>
             <wp:docPr id="3" name="Picture 3" descr="Рисунок 3 — MobileNetV3 Small с шагом головы 0.001"/>
             <wp:cNvGraphicFramePr>
-              <a:graphicFrameLocks noChangeAspect="1"/>
+              <a:graphicFrameLocks xmlns:a="http://schemas.openxmlformats.org/drawingml/2006/main" noChangeAspect="1"/>
             </wp:cNvGraphicFramePr>
-            <a:graphic>
+            <a:graphic xmlns:a="http://schemas.openxmlformats.org/drawingml/2006/main">
               <a:graphicData uri="http://schemas.openxmlformats.org/drawingml/2006/picture">
-                <pic:pic>
+                <pic:pic xmlns:pic="http://schemas.openxmlformats.org/drawingml/2006/picture">
                   <pic:nvPicPr>
                     <pic:cNvPr id="0" name="mobilenetv3_lr001.png"/>
                     <pic:cNvPicPr/>
                   </pic:nvPicPr>
                   <pic:blipFill>
-                    <a:blip r:embed="rId15"/>
+                    <a:blip r:embed="rId9"/>
                     <a:stretch>
                       <a:fillRect/>
                     </a:stretch>
@@ -2062,7 +3156,9 @@
                       <a:off x="0" y="0"/>
                       <a:ext cx="5760000" cy="2073600"/>
                     </a:xfrm>
-                    <a:prstGeom prst="rect"/>
+                    <a:prstGeom prst="rect">
+                      <a:avLst/>
+                    </a:prstGeom>
                   </pic:spPr>
                 </pic:pic>
               </a:graphicData>
@@ -2074,13 +3170,11 @@
     <w:p>
       <w:pPr>
         <w:widowControl/>
-        <w:spacing w:line="240" w:lineRule="auto" w:after="100" w:before="0"/>
+        <w:spacing w:after="100"/>
         <w:jc w:val="center"/>
       </w:pPr>
       <w:r>
         <w:rPr>
-          <w:rFonts w:ascii="Times New Roman" w:hAnsi="Times New Roman"/>
-          <w:b w:val="0"/>
           <w:sz w:val="24"/>
         </w:rPr>
         <w:t>Рисунок 3 — MobileNetV3 Small с шагом головы 0.001</w:t>
@@ -2089,29 +3183,124 @@
     <w:p>
       <w:pPr>
         <w:widowControl/>
-        <w:spacing w:line="360" w:lineRule="auto" w:after="100" w:before="0"/>
+        <w:spacing w:after="100" w:line="360" w:lineRule="auto"/>
         <w:jc w:val="both"/>
       </w:pPr>
       <w:r>
         <w:rPr>
-          <w:rFonts w:ascii="Times New Roman" w:hAnsi="Times New Roman"/>
-          <w:b w:val="0"/>
-          <w:sz w:val="28"/>
-        </w:rPr>
-        <w:t>MobileNetV3 заметно улучшается после размораживания: validation accuracy растёт с 27.3% до 86.4%. После эпохи 4 train accuracy увеличивается, а validation loss немного ухудшается — признак возможного начала переобучения. Меньший шаг 0.0003 уступил обеим моделям в данном бюджете. Полные кривые всех четырёх запусков включены в notebook.</w:t>
+          <w:sz w:val="28"/>
+        </w:rPr>
+        <w:t xml:space="preserve">MobileNetV3 заметно улучшается после размораживания: </w:t>
+      </w:r>
+      <w:proofErr w:type="spellStart"/>
+      <w:r>
+        <w:rPr>
+          <w:sz w:val="28"/>
+        </w:rPr>
+        <w:t>validation</w:t>
+      </w:r>
+      <w:proofErr w:type="spellEnd"/>
+      <w:r>
+        <w:rPr>
+          <w:sz w:val="28"/>
+        </w:rPr>
+        <w:t xml:space="preserve"> </w:t>
+      </w:r>
+      <w:proofErr w:type="spellStart"/>
+      <w:r>
+        <w:rPr>
+          <w:sz w:val="28"/>
+        </w:rPr>
+        <w:t>accuracy</w:t>
+      </w:r>
+      <w:proofErr w:type="spellEnd"/>
+      <w:r>
+        <w:rPr>
+          <w:sz w:val="28"/>
+        </w:rPr>
+        <w:t xml:space="preserve"> растёт с 27.3% до 86.4%. После эпохи 4 </w:t>
+      </w:r>
+      <w:proofErr w:type="spellStart"/>
+      <w:r>
+        <w:rPr>
+          <w:sz w:val="28"/>
+        </w:rPr>
+        <w:t>train</w:t>
+      </w:r>
+      <w:proofErr w:type="spellEnd"/>
+      <w:r>
+        <w:rPr>
+          <w:sz w:val="28"/>
+        </w:rPr>
+        <w:t xml:space="preserve"> </w:t>
+      </w:r>
+      <w:proofErr w:type="spellStart"/>
+      <w:r>
+        <w:rPr>
+          <w:sz w:val="28"/>
+        </w:rPr>
+        <w:t>accuracy</w:t>
+      </w:r>
+      <w:proofErr w:type="spellEnd"/>
+      <w:r>
+        <w:rPr>
+          <w:sz w:val="28"/>
+        </w:rPr>
+        <w:t xml:space="preserve"> увеличивается, а </w:t>
+      </w:r>
+      <w:proofErr w:type="spellStart"/>
+      <w:r>
+        <w:rPr>
+          <w:sz w:val="28"/>
+        </w:rPr>
+        <w:t>validation</w:t>
+      </w:r>
+      <w:proofErr w:type="spellEnd"/>
+      <w:r>
+        <w:rPr>
+          <w:sz w:val="28"/>
+        </w:rPr>
+        <w:t xml:space="preserve"> </w:t>
+      </w:r>
+      <w:proofErr w:type="spellStart"/>
+      <w:r>
+        <w:rPr>
+          <w:sz w:val="28"/>
+        </w:rPr>
+        <w:lastRenderedPageBreak/>
+        <w:t>loss</w:t>
+      </w:r>
+      <w:proofErr w:type="spellEnd"/>
+      <w:r>
+        <w:rPr>
+          <w:sz w:val="28"/>
+        </w:rPr>
+        <w:t xml:space="preserve"> немного ухудшается — признак возможного начала переобучения. Меньший шаг 0.0003 уступил обеим моделям в данном бюджете. Полные кривые всех четырёх запусков включены в </w:t>
+      </w:r>
+      <w:proofErr w:type="spellStart"/>
+      <w:r>
+        <w:rPr>
+          <w:sz w:val="28"/>
+        </w:rPr>
+        <w:t>notebook</w:t>
+      </w:r>
+      <w:proofErr w:type="spellEnd"/>
+      <w:r>
+        <w:rPr>
+          <w:sz w:val="28"/>
+        </w:rPr>
+        <w:t>.</w:t>
       </w:r>
     </w:p>
     <w:p>
       <w:pPr>
         <w:keepNext/>
-        <w:pageBreakBefore w:val="0"/>
         <w:widowControl/>
-        <w:spacing w:line="360" w:lineRule="auto" w:after="100" w:before="0"/>
+        <w:spacing w:after="100" w:line="360" w:lineRule="auto"/>
         <w:jc w:val="both"/>
       </w:pPr>
       <w:r>
         <w:rPr>
-          <w:rFonts w:ascii="Times New Roman" w:hAnsi="Times New Roman"/>
           <w:b/>
           <w:sz w:val="28"/>
         </w:rPr>
@@ -2120,17 +3309,17 @@
     </w:p>
     <w:tbl>
       <w:tblPr>
-        <w:tblW w:type="auto" w:w="0"/>
+        <w:tblW w:w="0" w:type="auto"/>
+        <w:tblBorders>
+          <w:top w:val="single" w:sz="4" w:space="0" w:color="808080"/>
+          <w:left w:val="single" w:sz="4" w:space="0" w:color="808080"/>
+          <w:bottom w:val="single" w:sz="4" w:space="0" w:color="808080"/>
+          <w:right w:val="single" w:sz="4" w:space="0" w:color="808080"/>
+          <w:insideH w:val="single" w:sz="4" w:space="0" w:color="808080"/>
+          <w:insideV w:val="single" w:sz="4" w:space="0" w:color="808080"/>
+        </w:tblBorders>
         <w:tblLayout w:type="fixed"/>
-        <w:tblLook w:firstColumn="1" w:firstRow="1" w:lastColumn="0" w:lastRow="0" w:noHBand="0" w:noVBand="1" w:val="04A0"/>
-        <w:tblBorders>
-          <w:top w:val="single" w:sz="4" w:color="808080"/>
-          <w:left w:val="single" w:sz="4" w:color="808080"/>
-          <w:bottom w:val="single" w:sz="4" w:color="808080"/>
-          <w:right w:val="single" w:sz="4" w:color="808080"/>
-          <w:insideH w:val="single" w:sz="4" w:color="808080"/>
-          <w:insideV w:val="single" w:sz="4" w:color="808080"/>
-        </w:tblBorders>
+        <w:tblLook w:val="04A0" w:firstRow="1" w:lastRow="0" w:firstColumn="1" w:lastColumn="0" w:noHBand="0" w:noVBand="1"/>
       </w:tblPr>
       <w:tblGrid>
         <w:gridCol w:w="1938"/>
@@ -2146,16 +3335,15 @@
         </w:trPr>
         <w:tc>
           <w:tcPr>
-            <w:tcW w:type="dxa" w:w="1938"/>
+            <w:tcW w:w="1938" w:type="dxa"/>
           </w:tcPr>
           <w:p>
             <w:pPr>
-              <w:spacing w:line="240" w:lineRule="auto" w:after="80" w:before="80"/>
+              <w:spacing w:before="80" w:after="80"/>
               <w:jc w:val="center"/>
             </w:pPr>
             <w:r>
               <w:rPr>
-                <w:rFonts w:ascii="Times New Roman" w:hAnsi="Times New Roman"/>
                 <w:b/>
                 <w:sz w:val="24"/>
               </w:rPr>
@@ -2165,16 +3353,15 @@
         </w:tc>
         <w:tc>
           <w:tcPr>
-            <w:tcW w:type="dxa" w:w="1938"/>
+            <w:tcW w:w="1938" w:type="dxa"/>
           </w:tcPr>
           <w:p>
             <w:pPr>
-              <w:spacing w:line="240" w:lineRule="auto" w:after="80" w:before="80"/>
+              <w:spacing w:before="80" w:after="80"/>
               <w:jc w:val="center"/>
             </w:pPr>
             <w:r>
               <w:rPr>
-                <w:rFonts w:ascii="Times New Roman" w:hAnsi="Times New Roman"/>
                 <w:b/>
                 <w:sz w:val="24"/>
               </w:rPr>
@@ -2184,54 +3371,62 @@
         </w:tc>
         <w:tc>
           <w:tcPr>
-            <w:tcW w:type="dxa" w:w="1938"/>
+            <w:tcW w:w="1938" w:type="dxa"/>
           </w:tcPr>
           <w:p>
             <w:pPr>
-              <w:spacing w:line="240" w:lineRule="auto" w:after="80" w:before="80"/>
+              <w:spacing w:before="80" w:after="80"/>
               <w:jc w:val="center"/>
             </w:pPr>
-            <w:r>
-              <w:rPr>
-                <w:rFonts w:ascii="Times New Roman" w:hAnsi="Times New Roman"/>
+            <w:proofErr w:type="spellStart"/>
+            <w:r>
+              <w:rPr>
                 <w:b/>
                 <w:sz w:val="24"/>
               </w:rPr>
               <w:t>Accuracy</w:t>
             </w:r>
+            <w:proofErr w:type="spellEnd"/>
           </w:p>
         </w:tc>
         <w:tc>
           <w:tcPr>
-            <w:tcW w:type="dxa" w:w="1938"/>
+            <w:tcW w:w="1938" w:type="dxa"/>
           </w:tcPr>
           <w:p>
             <w:pPr>
-              <w:spacing w:line="240" w:lineRule="auto" w:after="80" w:before="80"/>
+              <w:spacing w:before="80" w:after="80"/>
               <w:jc w:val="center"/>
             </w:pPr>
             <w:r>
               <w:rPr>
-                <w:rFonts w:ascii="Times New Roman" w:hAnsi="Times New Roman"/>
                 <w:b/>
                 <w:sz w:val="24"/>
               </w:rPr>
-              <w:t>Test loss</w:t>
-            </w:r>
+              <w:t xml:space="preserve">Test </w:t>
+            </w:r>
+            <w:proofErr w:type="spellStart"/>
+            <w:r>
+              <w:rPr>
+                <w:b/>
+                <w:sz w:val="24"/>
+              </w:rPr>
+              <w:t>loss</w:t>
+            </w:r>
+            <w:proofErr w:type="spellEnd"/>
           </w:p>
         </w:tc>
         <w:tc>
           <w:tcPr>
-            <w:tcW w:type="dxa" w:w="1938"/>
+            <w:tcW w:w="1938" w:type="dxa"/>
           </w:tcPr>
           <w:p>
             <w:pPr>
-              <w:spacing w:line="240" w:lineRule="auto" w:after="80" w:before="80"/>
+              <w:spacing w:before="80" w:after="80"/>
               <w:jc w:val="center"/>
             </w:pPr>
             <w:r>
               <w:rPr>
-                <w:rFonts w:ascii="Times New Roman" w:hAnsi="Times New Roman"/>
                 <w:b/>
                 <w:sz w:val="24"/>
               </w:rPr>
@@ -2246,17 +3441,15 @@
         </w:trPr>
         <w:tc>
           <w:tcPr>
-            <w:tcW w:type="dxa" w:w="1938"/>
+            <w:tcW w:w="1938" w:type="dxa"/>
           </w:tcPr>
           <w:p>
             <w:pPr>
-              <w:spacing w:line="240" w:lineRule="auto" w:after="80" w:before="80"/>
+              <w:spacing w:before="80" w:after="80"/>
               <w:jc w:val="center"/>
             </w:pPr>
             <w:r>
               <w:rPr>
-                <w:rFonts w:ascii="Times New Roman" w:hAnsi="Times New Roman"/>
-                <w:b w:val="0"/>
                 <w:sz w:val="24"/>
               </w:rPr>
               <w:t>ResNet18</w:t>
@@ -2265,17 +3458,15 @@
         </w:tc>
         <w:tc>
           <w:tcPr>
-            <w:tcW w:type="dxa" w:w="1938"/>
+            <w:tcW w:w="1938" w:type="dxa"/>
           </w:tcPr>
           <w:p>
             <w:pPr>
-              <w:spacing w:line="240" w:lineRule="auto" w:after="80" w:before="80"/>
+              <w:spacing w:before="80" w:after="80"/>
               <w:jc w:val="center"/>
             </w:pPr>
             <w:r>
               <w:rPr>
-                <w:rFonts w:ascii="Times New Roman" w:hAnsi="Times New Roman"/>
-                <w:b w:val="0"/>
                 <w:sz w:val="24"/>
               </w:rPr>
               <w:t>25/25</w:t>
@@ -2284,17 +3475,15 @@
         </w:tc>
         <w:tc>
           <w:tcPr>
-            <w:tcW w:type="dxa" w:w="1938"/>
+            <w:tcW w:w="1938" w:type="dxa"/>
           </w:tcPr>
           <w:p>
             <w:pPr>
-              <w:spacing w:line="240" w:lineRule="auto" w:after="80" w:before="80"/>
+              <w:spacing w:before="80" w:after="80"/>
               <w:jc w:val="center"/>
             </w:pPr>
             <w:r>
               <w:rPr>
-                <w:rFonts w:ascii="Times New Roman" w:hAnsi="Times New Roman"/>
-                <w:b w:val="0"/>
                 <w:sz w:val="24"/>
               </w:rPr>
               <w:t>100%</w:t>
@@ -2303,17 +3492,15 @@
         </w:tc>
         <w:tc>
           <w:tcPr>
-            <w:tcW w:type="dxa" w:w="1938"/>
+            <w:tcW w:w="1938" w:type="dxa"/>
           </w:tcPr>
           <w:p>
             <w:pPr>
-              <w:spacing w:line="240" w:lineRule="auto" w:after="80" w:before="80"/>
+              <w:spacing w:before="80" w:after="80"/>
               <w:jc w:val="center"/>
             </w:pPr>
             <w:r>
               <w:rPr>
-                <w:rFonts w:ascii="Times New Roman" w:hAnsi="Times New Roman"/>
-                <w:b w:val="0"/>
                 <w:sz w:val="24"/>
               </w:rPr>
               <w:t>0.6255</w:t>
@@ -2322,17 +3509,15 @@
         </w:tc>
         <w:tc>
           <w:tcPr>
-            <w:tcW w:type="dxa" w:w="1938"/>
+            <w:tcW w:w="1938" w:type="dxa"/>
           </w:tcPr>
           <w:p>
             <w:pPr>
-              <w:spacing w:line="240" w:lineRule="auto" w:after="80" w:before="80"/>
+              <w:spacing w:before="80" w:after="80"/>
               <w:jc w:val="center"/>
             </w:pPr>
             <w:r>
               <w:rPr>
-                <w:rFonts w:ascii="Times New Roman" w:hAnsi="Times New Roman"/>
-                <w:b w:val="0"/>
                 <w:sz w:val="24"/>
               </w:rPr>
               <w:t>22.31</w:t>
@@ -2346,17 +3531,15 @@
         </w:trPr>
         <w:tc>
           <w:tcPr>
-            <w:tcW w:type="dxa" w:w="1938"/>
+            <w:tcW w:w="1938" w:type="dxa"/>
           </w:tcPr>
           <w:p>
             <w:pPr>
-              <w:spacing w:line="240" w:lineRule="auto" w:after="80" w:before="80"/>
+              <w:spacing w:before="80" w:after="80"/>
               <w:jc w:val="center"/>
             </w:pPr>
             <w:r>
               <w:rPr>
-                <w:rFonts w:ascii="Times New Roman" w:hAnsi="Times New Roman"/>
-                <w:b w:val="0"/>
                 <w:sz w:val="24"/>
               </w:rPr>
               <w:t>MobileNetV3</w:t>
@@ -2365,17 +3548,15 @@
         </w:tc>
         <w:tc>
           <w:tcPr>
-            <w:tcW w:type="dxa" w:w="1938"/>
+            <w:tcW w:w="1938" w:type="dxa"/>
           </w:tcPr>
           <w:p>
             <w:pPr>
-              <w:spacing w:line="240" w:lineRule="auto" w:after="80" w:before="80"/>
+              <w:spacing w:before="80" w:after="80"/>
               <w:jc w:val="center"/>
             </w:pPr>
             <w:r>
               <w:rPr>
-                <w:rFonts w:ascii="Times New Roman" w:hAnsi="Times New Roman"/>
-                <w:b w:val="0"/>
                 <w:sz w:val="24"/>
               </w:rPr>
               <w:t>23/25</w:t>
@@ -2384,17 +3565,15 @@
         </w:tc>
         <w:tc>
           <w:tcPr>
-            <w:tcW w:type="dxa" w:w="1938"/>
+            <w:tcW w:w="1938" w:type="dxa"/>
           </w:tcPr>
           <w:p>
             <w:pPr>
-              <w:spacing w:line="240" w:lineRule="auto" w:after="80" w:before="80"/>
+              <w:spacing w:before="80" w:after="80"/>
               <w:jc w:val="center"/>
             </w:pPr>
             <w:r>
               <w:rPr>
-                <w:rFonts w:ascii="Times New Roman" w:hAnsi="Times New Roman"/>
-                <w:b w:val="0"/>
                 <w:sz w:val="24"/>
               </w:rPr>
               <w:t>92%</w:t>
@@ -2403,17 +3582,15 @@
         </w:tc>
         <w:tc>
           <w:tcPr>
-            <w:tcW w:type="dxa" w:w="1938"/>
+            <w:tcW w:w="1938" w:type="dxa"/>
           </w:tcPr>
           <w:p>
             <w:pPr>
-              <w:spacing w:line="240" w:lineRule="auto" w:after="80" w:before="80"/>
+              <w:spacing w:before="80" w:after="80"/>
               <w:jc w:val="center"/>
             </w:pPr>
             <w:r>
               <w:rPr>
-                <w:rFonts w:ascii="Times New Roman" w:hAnsi="Times New Roman"/>
-                <w:b w:val="0"/>
                 <w:sz w:val="24"/>
               </w:rPr>
               <w:t>0.5391</w:t>
@@ -2422,17 +3599,15 @@
         </w:tc>
         <w:tc>
           <w:tcPr>
-            <w:tcW w:type="dxa" w:w="1938"/>
+            <w:tcW w:w="1938" w:type="dxa"/>
           </w:tcPr>
           <w:p>
             <w:pPr>
-              <w:spacing w:line="240" w:lineRule="auto" w:after="80" w:before="80"/>
+              <w:spacing w:before="80" w:after="80"/>
               <w:jc w:val="center"/>
             </w:pPr>
             <w:r>
               <w:rPr>
-                <w:rFonts w:ascii="Times New Roman" w:hAnsi="Times New Roman"/>
-                <w:b w:val="0"/>
                 <w:sz w:val="24"/>
               </w:rPr>
               <w:t>8.96</w:t>
@@ -2444,41 +3619,98 @@
     <w:p>
       <w:pPr>
         <w:widowControl/>
-        <w:spacing w:line="360" w:lineRule="auto" w:after="100" w:before="0"/>
+        <w:spacing w:after="100" w:line="360" w:lineRule="auto"/>
         <w:jc w:val="both"/>
       </w:pPr>
       <w:r>
         <w:rPr>
-          <w:rFonts w:ascii="Times New Roman" w:hAnsi="Times New Roman"/>
-          <w:b w:val="0"/>
-          <w:sz w:val="28"/>
-        </w:rPr>
-        <w:t>Время указано для шести эпох выбранного запуска, без скачивания pretrained весов и финальной отрисовки. ResNet18 содержит в 7.35 раза больше параметров и обучалась примерно в 2.5 раза дольше. MobileNetV3 компактнее и имеет меньшую test loss, но допускает две ошибки. По заранее выбранному критерию accuracy предпочтительна ResNet18.</w:t>
+          <w:sz w:val="28"/>
+        </w:rPr>
+        <w:t xml:space="preserve">Время указано для шести эпох выбранного запуска, без скачивания </w:t>
+      </w:r>
+      <w:proofErr w:type="spellStart"/>
+      <w:r>
+        <w:rPr>
+          <w:sz w:val="28"/>
+        </w:rPr>
+        <w:t>pretrained</w:t>
+      </w:r>
+      <w:proofErr w:type="spellEnd"/>
+      <w:r>
+        <w:rPr>
+          <w:sz w:val="28"/>
+        </w:rPr>
+        <w:t xml:space="preserve"> весов и финальной отрисовки. ResNet18 содержит в 7.35 раза больше параметров и обучалась примерно в 2.5 раза дольше. MobileNetV3 компактнее и имеет меньшую </w:t>
+      </w:r>
+      <w:proofErr w:type="spellStart"/>
+      <w:r>
+        <w:rPr>
+          <w:sz w:val="28"/>
+        </w:rPr>
+        <w:t>test</w:t>
+      </w:r>
+      <w:proofErr w:type="spellEnd"/>
+      <w:r>
+        <w:rPr>
+          <w:sz w:val="28"/>
+        </w:rPr>
+        <w:t xml:space="preserve"> </w:t>
+      </w:r>
+      <w:proofErr w:type="spellStart"/>
+      <w:r>
+        <w:rPr>
+          <w:sz w:val="28"/>
+        </w:rPr>
+        <w:t>loss</w:t>
+      </w:r>
+      <w:proofErr w:type="spellEnd"/>
+      <w:r>
+        <w:rPr>
+          <w:sz w:val="28"/>
+        </w:rPr>
+        <w:t xml:space="preserve">, но допускает две ошибки. По заранее выбранному критерию </w:t>
+      </w:r>
+      <w:proofErr w:type="spellStart"/>
+      <w:r>
+        <w:rPr>
+          <w:sz w:val="28"/>
+        </w:rPr>
+        <w:t>accuracy</w:t>
+      </w:r>
+      <w:proofErr w:type="spellEnd"/>
+      <w:r>
+        <w:rPr>
+          <w:sz w:val="28"/>
+        </w:rPr>
+        <w:t xml:space="preserve"> предпочтительна ResNet18.</w:t>
       </w:r>
     </w:p>
     <w:p>
       <w:pPr>
         <w:keepNext/>
-        <w:spacing w:after="0"/>
         <w:jc w:val="center"/>
       </w:pPr>
       <w:r>
+        <w:rPr>
+          <w:noProof/>
+        </w:rPr>
         <w:drawing>
-          <wp:inline xmlns:a="http://schemas.openxmlformats.org/drawingml/2006/main" xmlns:pic="http://schemas.openxmlformats.org/drawingml/2006/picture">
+          <wp:inline distT="0" distB="0" distL="0" distR="0" wp14:anchorId="58123669" wp14:editId="4DBE3961">
             <wp:extent cx="5760000" cy="2304000"/>
+            <wp:effectExtent l="0" t="0" r="0" b="0"/>
             <wp:docPr id="4" name="Picture 4" descr="Рисунок 4 — Матрицы ошибок двух выбранных запусков"/>
             <wp:cNvGraphicFramePr>
-              <a:graphicFrameLocks noChangeAspect="1"/>
+              <a:graphicFrameLocks xmlns:a="http://schemas.openxmlformats.org/drawingml/2006/main" noChangeAspect="1"/>
             </wp:cNvGraphicFramePr>
-            <a:graphic>
+            <a:graphic xmlns:a="http://schemas.openxmlformats.org/drawingml/2006/main">
               <a:graphicData uri="http://schemas.openxmlformats.org/drawingml/2006/picture">
-                <pic:pic>
+                <pic:pic xmlns:pic="http://schemas.openxmlformats.org/drawingml/2006/picture">
                   <pic:nvPicPr>
                     <pic:cNvPr id="0" name="confusion_combined.png"/>
                     <pic:cNvPicPr/>
                   </pic:nvPicPr>
                   <pic:blipFill>
-                    <a:blip r:embed="rId16"/>
+                    <a:blip r:embed="rId10"/>
                     <a:stretch>
                       <a:fillRect/>
                     </a:stretch>
@@ -2488,7 +3720,9 @@
                       <a:off x="0" y="0"/>
                       <a:ext cx="5760000" cy="2304000"/>
                     </a:xfrm>
-                    <a:prstGeom prst="rect"/>
+                    <a:prstGeom prst="rect">
+                      <a:avLst/>
+                    </a:prstGeom>
                   </pic:spPr>
                 </pic:pic>
               </a:graphicData>
@@ -2500,13 +3734,11 @@
     <w:p>
       <w:pPr>
         <w:widowControl/>
-        <w:spacing w:line="240" w:lineRule="auto" w:after="100" w:before="0"/>
+        <w:spacing w:after="100"/>
         <w:jc w:val="center"/>
       </w:pPr>
       <w:r>
         <w:rPr>
-          <w:rFonts w:ascii="Times New Roman" w:hAnsi="Times New Roman"/>
-          <w:b w:val="0"/>
           <w:sz w:val="24"/>
         </w:rPr>
         <w:t>Рисунок 4 — Матрицы ошибок двух выбранных запусков</w:t>
@@ -2515,44 +3747,141 @@
     <w:p>
       <w:pPr>
         <w:widowControl/>
-        <w:spacing w:line="360" w:lineRule="auto" w:after="100" w:before="0"/>
+        <w:spacing w:after="100" w:line="360" w:lineRule="auto"/>
         <w:jc w:val="both"/>
       </w:pPr>
       <w:r>
         <w:rPr>
-          <w:rFonts w:ascii="Times New Roman" w:hAnsi="Times New Roman"/>
-          <w:b w:val="0"/>
-          <w:sz w:val="28"/>
-        </w:rPr>
-        <w:t>Порядок классов: butterfly, dragonfly, ladybird. Строки — истинные классы, столбцы — прогноз. ResNet18: [[7,0,0],[0,9,0],[0,0,9]]. MobileNetV3: [[7,0,0],[0,8,1],[1,0,8]]. У MobileNetV3 одна стрекоза отнесена к божьим коровкам, одна божья коровка — к бабочкам.</w:t>
+          <w:sz w:val="28"/>
+        </w:rPr>
+        <w:t>Порядок</w:t>
+      </w:r>
+      <w:r>
+        <w:rPr>
+          <w:sz w:val="28"/>
+          <w:lang w:val="en-US"/>
+        </w:rPr>
+        <w:t xml:space="preserve"> </w:t>
+      </w:r>
+      <w:r>
+        <w:rPr>
+          <w:sz w:val="28"/>
+        </w:rPr>
+        <w:t>классов</w:t>
+      </w:r>
+      <w:r>
+        <w:rPr>
+          <w:sz w:val="28"/>
+          <w:lang w:val="en-US"/>
+        </w:rPr>
+        <w:t xml:space="preserve">: butterfly, dragonfly, ladybird. </w:t>
+      </w:r>
+      <w:r>
+        <w:rPr>
+          <w:sz w:val="28"/>
+        </w:rPr>
+        <w:t>Строки — истинные классы, столбцы — прогноз. ResNet18: [[7,0,0</w:t>
+      </w:r>
+      <w:proofErr w:type="gramStart"/>
+      <w:r>
+        <w:rPr>
+          <w:sz w:val="28"/>
+        </w:rPr>
+        <w:t>],[</w:t>
+      </w:r>
+      <w:proofErr w:type="gramEnd"/>
+      <w:r>
+        <w:rPr>
+          <w:sz w:val="28"/>
+        </w:rPr>
+        <w:t>0,9,0</w:t>
+      </w:r>
+      <w:proofErr w:type="gramStart"/>
+      <w:r>
+        <w:rPr>
+          <w:sz w:val="28"/>
+        </w:rPr>
+        <w:t>],[</w:t>
+      </w:r>
+      <w:proofErr w:type="gramEnd"/>
+      <w:r>
+        <w:rPr>
+          <w:sz w:val="28"/>
+        </w:rPr>
+        <w:t>0,0,9]]. MobileNetV3: [[7,0,0</w:t>
+      </w:r>
+      <w:proofErr w:type="gramStart"/>
+      <w:r>
+        <w:rPr>
+          <w:sz w:val="28"/>
+        </w:rPr>
+        <w:t>],[</w:t>
+      </w:r>
+      <w:proofErr w:type="gramEnd"/>
+      <w:r>
+        <w:rPr>
+          <w:sz w:val="28"/>
+        </w:rPr>
+        <w:t>0,8,1</w:t>
+      </w:r>
+      <w:proofErr w:type="gramStart"/>
+      <w:r>
+        <w:rPr>
+          <w:sz w:val="28"/>
+        </w:rPr>
+        <w:t>],[</w:t>
+      </w:r>
+      <w:proofErr w:type="gramEnd"/>
+      <w:r>
+        <w:rPr>
+          <w:sz w:val="28"/>
+        </w:rPr>
+        <w:t>1,0,8]]. У MobileNetV3 одна стрекоза отнесена к божьим коровкам, одна божья коровка — к бабочкам.</w:t>
       </w:r>
     </w:p>
     <w:p>
       <w:pPr>
         <w:widowControl/>
-        <w:spacing w:line="360" w:lineRule="auto" w:after="100" w:before="0"/>
+        <w:spacing w:after="100" w:line="360" w:lineRule="auto"/>
         <w:jc w:val="both"/>
       </w:pPr>
       <w:r>
         <w:rPr>
-          <w:rFonts w:ascii="Times New Roman" w:hAnsi="Times New Roman"/>
-          <w:b w:val="0"/>
-          <w:sz w:val="28"/>
-        </w:rPr>
-        <w:t>Одна ошибка на 25 объектах меняет accuracy на 4 процентных пункта. Результат 25/25 не означает безошибочную классификацию новых фотографий. Сравнение проведено на одной фиксированной части данных; неизвестные виды не представлены.</w:t>
+          <w:sz w:val="28"/>
+        </w:rPr>
+        <w:t xml:space="preserve">Одна ошибка на 25 объектах меняет </w:t>
+      </w:r>
+      <w:proofErr w:type="spellStart"/>
+      <w:r>
+        <w:rPr>
+          <w:sz w:val="28"/>
+        </w:rPr>
+        <w:t>accuracy</w:t>
+      </w:r>
+      <w:proofErr w:type="spellEnd"/>
+      <w:r>
+        <w:rPr>
+          <w:sz w:val="28"/>
+        </w:rPr>
+        <w:t xml:space="preserve"> на 4 процентных пункта. Результат 25/25 не означает безошибочную классификацию новых фотографий. Сравнение </w:t>
+      </w:r>
+      <w:r>
+        <w:rPr>
+          <w:sz w:val="28"/>
+        </w:rPr>
+        <w:lastRenderedPageBreak/>
+        <w:t>проведено на одной фиксированной части данных; неизвестные виды не представлены.</w:t>
       </w:r>
     </w:p>
     <w:p>
       <w:pPr>
         <w:keepNext/>
-        <w:pageBreakBefore w:val="0"/>
         <w:widowControl/>
-        <w:spacing w:line="360" w:lineRule="auto" w:after="100" w:before="0"/>
+        <w:spacing w:after="100" w:line="360" w:lineRule="auto"/>
         <w:jc w:val="both"/>
       </w:pPr>
       <w:r>
         <w:rPr>
-          <w:rFonts w:ascii="Times New Roman" w:hAnsi="Times New Roman"/>
           <w:b/>
           <w:sz w:val="28"/>
         </w:rPr>
@@ -2562,26 +3891,29 @@
     <w:p>
       <w:pPr>
         <w:keepNext/>
-        <w:spacing w:after="0"/>
         <w:jc w:val="center"/>
       </w:pPr>
       <w:r>
+        <w:rPr>
+          <w:noProof/>
+        </w:rPr>
         <w:drawing>
-          <wp:inline xmlns:a="http://schemas.openxmlformats.org/drawingml/2006/main" xmlns:pic="http://schemas.openxmlformats.org/drawingml/2006/picture">
+          <wp:inline distT="0" distB="0" distL="0" distR="0" wp14:anchorId="15AC12E9" wp14:editId="055E31DD">
             <wp:extent cx="5760000" cy="3240000"/>
+            <wp:effectExtent l="0" t="0" r="0" b="0"/>
             <wp:docPr id="5" name="Picture 5" descr="Рисунок 5 — Два ошибочных прогноза MobileNetV3"/>
             <wp:cNvGraphicFramePr>
-              <a:graphicFrameLocks noChangeAspect="1"/>
+              <a:graphicFrameLocks xmlns:a="http://schemas.openxmlformats.org/drawingml/2006/main" noChangeAspect="1"/>
             </wp:cNvGraphicFramePr>
-            <a:graphic>
+            <a:graphic xmlns:a="http://schemas.openxmlformats.org/drawingml/2006/main">
               <a:graphicData uri="http://schemas.openxmlformats.org/drawingml/2006/picture">
-                <pic:pic>
+                <pic:pic xmlns:pic="http://schemas.openxmlformats.org/drawingml/2006/picture">
                   <pic:nvPicPr>
                     <pic:cNvPr id="0" name="errors.png"/>
                     <pic:cNvPicPr/>
                   </pic:nvPicPr>
                   <pic:blipFill>
-                    <a:blip r:embed="rId17"/>
+                    <a:blip r:embed="rId11"/>
                     <a:stretch>
                       <a:fillRect/>
                     </a:stretch>
@@ -2591,7 +3923,9 @@
                       <a:off x="0" y="0"/>
                       <a:ext cx="5760000" cy="3240000"/>
                     </a:xfrm>
-                    <a:prstGeom prst="rect"/>
+                    <a:prstGeom prst="rect">
+                      <a:avLst/>
+                    </a:prstGeom>
                   </pic:spPr>
                 </pic:pic>
               </a:graphicData>
@@ -2603,13 +3937,11 @@
     <w:p>
       <w:pPr>
         <w:widowControl/>
-        <w:spacing w:line="240" w:lineRule="auto" w:after="100" w:before="0"/>
+        <w:spacing w:after="100"/>
         <w:jc w:val="center"/>
       </w:pPr>
       <w:r>
         <w:rPr>
-          <w:rFonts w:ascii="Times New Roman" w:hAnsi="Times New Roman"/>
-          <w:b w:val="0"/>
           <w:sz w:val="24"/>
         </w:rPr>
         <w:t>Рисунок 5 — Два ошибочных прогноза MobileNetV3</w:t>
@@ -2618,13 +3950,11 @@
     <w:p>
       <w:pPr>
         <w:widowControl/>
-        <w:spacing w:line="360" w:lineRule="auto" w:after="100" w:before="0"/>
+        <w:spacing w:after="100" w:line="360" w:lineRule="auto"/>
         <w:jc w:val="both"/>
       </w:pPr>
       <w:r>
         <w:rPr>
-          <w:rFonts w:ascii="Times New Roman" w:hAnsi="Times New Roman"/>
-          <w:b w:val="0"/>
           <w:sz w:val="28"/>
         </w:rPr>
         <w:t>На фото 113143673 стрекоза сидит на тонкой ветке, а прозрачные крылья слабо отличаются от фона. На фото 185666756 божья коровка занимает ограниченную область фактурного стебля. Масштаб, контраст и фон — возможные причины ошибок; это визуальная гипотеза, а не доказательство причин по анализу внутренних признаков сети.</w:t>
@@ -2633,29 +3963,39 @@
     <w:p>
       <w:pPr>
         <w:widowControl/>
-        <w:spacing w:line="360" w:lineRule="auto" w:after="100" w:before="0"/>
+        <w:spacing w:after="100" w:line="360" w:lineRule="auto"/>
         <w:jc w:val="both"/>
       </w:pPr>
       <w:r>
         <w:rPr>
-          <w:rFonts w:ascii="Times New Roman" w:hAnsi="Times New Roman"/>
-          <w:b w:val="0"/>
-          <w:sz w:val="28"/>
-        </w:rPr>
-        <w:t>Для следующего независимого эксперимента полезно добавить малоконтрастные сцены, попробовать выделение области насекомого или аугментацию фона. Текущий тест после анализа не использовался для изменения модели и гиперпараметров.</w:t>
+          <w:sz w:val="28"/>
+        </w:rPr>
+        <w:t xml:space="preserve">Для следующего независимого эксперимента полезно добавить малоконтрастные сцены, попробовать выделение области насекомого или аугментацию фона. Текущий тест после анализа не использовался для изменения модели и </w:t>
+      </w:r>
+      <w:proofErr w:type="spellStart"/>
+      <w:r>
+        <w:rPr>
+          <w:sz w:val="28"/>
+        </w:rPr>
+        <w:t>гиперпараметров</w:t>
+      </w:r>
+      <w:proofErr w:type="spellEnd"/>
+      <w:r>
+        <w:rPr>
+          <w:sz w:val="28"/>
+        </w:rPr>
+        <w:t>.</w:t>
       </w:r>
     </w:p>
     <w:p>
       <w:pPr>
         <w:keepNext/>
-        <w:pageBreakBefore w:val="0"/>
         <w:widowControl/>
-        <w:spacing w:line="360" w:lineRule="auto" w:after="100" w:before="0"/>
+        <w:spacing w:after="100" w:line="360" w:lineRule="auto"/>
         <w:jc w:val="both"/>
       </w:pPr>
       <w:r>
         <w:rPr>
-          <w:rFonts w:ascii="Times New Roman" w:hAnsi="Times New Roman"/>
           <w:b/>
           <w:sz w:val="28"/>
         </w:rPr>
@@ -2665,44 +4005,101 @@
     <w:p>
       <w:pPr>
         <w:widowControl/>
-        <w:spacing w:line="360" w:lineRule="auto" w:after="100" w:before="0"/>
+        <w:spacing w:after="100" w:line="360" w:lineRule="auto"/>
         <w:jc w:val="both"/>
       </w:pPr>
       <w:r>
         <w:rPr>
-          <w:rFonts w:ascii="Times New Roman" w:hAnsi="Times New Roman"/>
-          <w:b w:val="0"/>
-          <w:sz w:val="28"/>
-        </w:rPr>
-        <w:t>Подборка смещена к подписанным снимкам из открытого каталога. Метки получены из названий Commons и визуально проверены на соответствие группе, но экспертная биологическая верификация не выполнялась. В каждой группе только один вид. Авторская группировка уменьшает утечку в нашем split, но не доказывает отсутствие пересечения с исходными данными ImageNet.</w:t>
+          <w:sz w:val="28"/>
+        </w:rPr>
+        <w:t xml:space="preserve">Подборка смещена к подписанным снимкам из открытого каталога. Метки получены из названий </w:t>
+      </w:r>
+      <w:proofErr w:type="spellStart"/>
+      <w:r>
+        <w:rPr>
+          <w:sz w:val="28"/>
+        </w:rPr>
+        <w:t>Commons</w:t>
+      </w:r>
+      <w:proofErr w:type="spellEnd"/>
+      <w:r>
+        <w:rPr>
+          <w:sz w:val="28"/>
+        </w:rPr>
+        <w:t xml:space="preserve"> и визуально проверены на соответствие группе, но экспертная биологическая верификация не выполнялась. В каждой группе </w:t>
+      </w:r>
+      <w:r>
+        <w:rPr>
+          <w:sz w:val="28"/>
+        </w:rPr>
+        <w:lastRenderedPageBreak/>
+        <w:t xml:space="preserve">только один вид. Авторская группировка уменьшает утечку в нашем </w:t>
+      </w:r>
+      <w:proofErr w:type="spellStart"/>
+      <w:r>
+        <w:rPr>
+          <w:sz w:val="28"/>
+        </w:rPr>
+        <w:t>split</w:t>
+      </w:r>
+      <w:proofErr w:type="spellEnd"/>
+      <w:r>
+        <w:rPr>
+          <w:sz w:val="28"/>
+        </w:rPr>
+        <w:t xml:space="preserve">, но не доказывает отсутствие пересечения с исходными данными </w:t>
+      </w:r>
+      <w:proofErr w:type="spellStart"/>
+      <w:r>
+        <w:rPr>
+          <w:sz w:val="28"/>
+        </w:rPr>
+        <w:t>ImageNet</w:t>
+      </w:r>
+      <w:proofErr w:type="spellEnd"/>
+      <w:r>
+        <w:rPr>
+          <w:sz w:val="28"/>
+        </w:rPr>
+        <w:t>.</w:t>
       </w:r>
     </w:p>
     <w:p>
       <w:pPr>
         <w:widowControl/>
-        <w:spacing w:line="360" w:lineRule="auto" w:after="100" w:before="0"/>
+        <w:spacing w:after="100" w:line="360" w:lineRule="auto"/>
         <w:jc w:val="both"/>
       </w:pPr>
       <w:r>
         <w:rPr>
-          <w:rFonts w:ascii="Times New Roman" w:hAnsi="Times New Roman"/>
-          <w:b w:val="0"/>
-          <w:sz w:val="28"/>
-        </w:rPr>
-        <w:t>Приложение всегда выбирает один из трёх классов; неизвестные насекомые и посторонние объекты не отклоняются. Softmax показывает относительные оценки модели и не является калиброванной вероятностью правильного ответа.</w:t>
+          <w:sz w:val="28"/>
+        </w:rPr>
+        <w:t xml:space="preserve">Приложение всегда выбирает один из трёх классов; неизвестные насекомые и посторонние объекты не отклоняются. </w:t>
+      </w:r>
+      <w:proofErr w:type="spellStart"/>
+      <w:r>
+        <w:rPr>
+          <w:sz w:val="28"/>
+        </w:rPr>
+        <w:t>Softmax</w:t>
+      </w:r>
+      <w:proofErr w:type="spellEnd"/>
+      <w:r>
+        <w:rPr>
+          <w:sz w:val="28"/>
+        </w:rPr>
+        <w:t xml:space="preserve"> показывает относительные оценки модели и не является калиброванной вероятностью правильного ответа.</w:t>
       </w:r>
     </w:p>
     <w:p>
       <w:pPr>
         <w:keepNext/>
-        <w:pageBreakBefore w:val="0"/>
         <w:widowControl/>
-        <w:spacing w:line="360" w:lineRule="auto" w:after="100" w:before="0"/>
+        <w:spacing w:after="100" w:line="360" w:lineRule="auto"/>
         <w:jc w:val="both"/>
       </w:pPr>
       <w:r>
         <w:rPr>
-          <w:rFonts w:ascii="Times New Roman" w:hAnsi="Times New Roman"/>
           <w:b/>
           <w:sz w:val="28"/>
         </w:rPr>
@@ -2712,56 +4109,228 @@
     <w:p>
       <w:pPr>
         <w:widowControl/>
-        <w:spacing w:line="360" w:lineRule="auto" w:after="100" w:before="0"/>
+        <w:spacing w:after="100" w:line="360" w:lineRule="auto"/>
         <w:jc w:val="both"/>
       </w:pPr>
       <w:r>
         <w:rPr>
-          <w:rFonts w:ascii="Times New Roman" w:hAnsi="Times New Roman"/>
-          <w:b w:val="0"/>
-          <w:sz w:val="28"/>
-        </w:rPr>
-        <w:t>Выбранный checkpoint экспортирован в app/model.onnx: opset 17, динамический batch, вход N × 3 × 160 × 160 float32, выход N × 3 logits. Классы и нормализация записаны в model.json. Размер модели — 44.70 MB. Проверки onnx.checker и ONNX Runtime на CPU прошли [3].</w:t>
+          <w:sz w:val="28"/>
+        </w:rPr>
+        <w:t xml:space="preserve">Выбранный </w:t>
+      </w:r>
+      <w:proofErr w:type="spellStart"/>
+      <w:r>
+        <w:rPr>
+          <w:sz w:val="28"/>
+        </w:rPr>
+        <w:t>checkpoint</w:t>
+      </w:r>
+      <w:proofErr w:type="spellEnd"/>
+      <w:r>
+        <w:rPr>
+          <w:sz w:val="28"/>
+        </w:rPr>
+        <w:t xml:space="preserve"> экспортирован в </w:t>
+      </w:r>
+      <w:proofErr w:type="spellStart"/>
+      <w:r>
+        <w:rPr>
+          <w:sz w:val="28"/>
+        </w:rPr>
+        <w:t>app</w:t>
+      </w:r>
+      <w:proofErr w:type="spellEnd"/>
+      <w:r>
+        <w:rPr>
+          <w:sz w:val="28"/>
+        </w:rPr>
+        <w:t>/</w:t>
+      </w:r>
+      <w:proofErr w:type="spellStart"/>
+      <w:r>
+        <w:rPr>
+          <w:sz w:val="28"/>
+        </w:rPr>
+        <w:t>model.onnx</w:t>
+      </w:r>
+      <w:proofErr w:type="spellEnd"/>
+      <w:r>
+        <w:rPr>
+          <w:sz w:val="28"/>
+        </w:rPr>
+        <w:t xml:space="preserve">: </w:t>
+      </w:r>
+      <w:proofErr w:type="spellStart"/>
+      <w:r>
+        <w:rPr>
+          <w:sz w:val="28"/>
+        </w:rPr>
+        <w:t>opset</w:t>
+      </w:r>
+      <w:proofErr w:type="spellEnd"/>
+      <w:r>
+        <w:rPr>
+          <w:sz w:val="28"/>
+        </w:rPr>
+        <w:t xml:space="preserve"> 17, динамический </w:t>
+      </w:r>
+      <w:proofErr w:type="spellStart"/>
+      <w:r>
+        <w:rPr>
+          <w:sz w:val="28"/>
+        </w:rPr>
+        <w:t>batch</w:t>
+      </w:r>
+      <w:proofErr w:type="spellEnd"/>
+      <w:r>
+        <w:rPr>
+          <w:sz w:val="28"/>
+        </w:rPr>
+        <w:t xml:space="preserve">, вход N × 3 × 160 × 160 float32, выход N × 3 </w:t>
+      </w:r>
+      <w:proofErr w:type="spellStart"/>
+      <w:r>
+        <w:rPr>
+          <w:sz w:val="28"/>
+        </w:rPr>
+        <w:t>logits</w:t>
+      </w:r>
+      <w:proofErr w:type="spellEnd"/>
+      <w:r>
+        <w:rPr>
+          <w:sz w:val="28"/>
+        </w:rPr>
+        <w:t xml:space="preserve">. Классы и нормализация записаны в </w:t>
+      </w:r>
+      <w:proofErr w:type="spellStart"/>
+      <w:proofErr w:type="gramStart"/>
+      <w:r>
+        <w:rPr>
+          <w:sz w:val="28"/>
+        </w:rPr>
+        <w:t>model.json</w:t>
+      </w:r>
+      <w:proofErr w:type="spellEnd"/>
+      <w:proofErr w:type="gramEnd"/>
+      <w:r>
+        <w:rPr>
+          <w:sz w:val="28"/>
+        </w:rPr>
+        <w:t xml:space="preserve">. Размер модели — 44.70 MB. Проверки </w:t>
+      </w:r>
+      <w:proofErr w:type="spellStart"/>
+      <w:proofErr w:type="gramStart"/>
+      <w:r>
+        <w:rPr>
+          <w:sz w:val="28"/>
+        </w:rPr>
+        <w:t>onnx.checker</w:t>
+      </w:r>
+      <w:proofErr w:type="spellEnd"/>
+      <w:proofErr w:type="gramEnd"/>
+      <w:r>
+        <w:rPr>
+          <w:sz w:val="28"/>
+        </w:rPr>
+        <w:t xml:space="preserve"> и ONNX </w:t>
+      </w:r>
+      <w:proofErr w:type="spellStart"/>
+      <w:r>
+        <w:rPr>
+          <w:sz w:val="28"/>
+        </w:rPr>
+        <w:t>Runtime</w:t>
+      </w:r>
+      <w:proofErr w:type="spellEnd"/>
+      <w:r>
+        <w:rPr>
+          <w:sz w:val="28"/>
+        </w:rPr>
+        <w:t xml:space="preserve"> на CPU прошли [3].</w:t>
       </w:r>
     </w:p>
     <w:p>
       <w:pPr>
         <w:widowControl/>
-        <w:spacing w:line="360" w:lineRule="auto" w:after="100" w:before="0"/>
+        <w:spacing w:after="100" w:line="360" w:lineRule="auto"/>
         <w:jc w:val="both"/>
       </w:pPr>
       <w:r>
         <w:rPr>
-          <w:rFonts w:ascii="Times New Roman" w:hAnsi="Times New Roman"/>
-          <w:b w:val="0"/>
-          <w:sz w:val="28"/>
-        </w:rPr>
-        <w:t>На 25 тестовых фотографиях максимальное расхождение логитов PyTorch и ONNX составило 1.13 × 10⁻⁶; все прогнозы совпали. Совпадение предобработки проверено поэлементно. Медиана инференса — 8.40 мс, p95 — 9.81 мс: batch 1, два потока CPU, 10 прогревов и 50 измерений без предобработки.</w:t>
+          <w:sz w:val="28"/>
+        </w:rPr>
+        <w:t xml:space="preserve">На 25 тестовых фотографиях максимальное расхождение </w:t>
+      </w:r>
+      <w:proofErr w:type="spellStart"/>
+      <w:r>
+        <w:rPr>
+          <w:sz w:val="28"/>
+        </w:rPr>
+        <w:t>логитов</w:t>
+      </w:r>
+      <w:proofErr w:type="spellEnd"/>
+      <w:r>
+        <w:rPr>
+          <w:sz w:val="28"/>
+        </w:rPr>
+        <w:t xml:space="preserve"> </w:t>
+      </w:r>
+      <w:proofErr w:type="spellStart"/>
+      <w:r>
+        <w:rPr>
+          <w:sz w:val="28"/>
+        </w:rPr>
+        <w:t>PyTorch</w:t>
+      </w:r>
+      <w:proofErr w:type="spellEnd"/>
+      <w:r>
+        <w:rPr>
+          <w:sz w:val="28"/>
+        </w:rPr>
+        <w:t xml:space="preserve"> и ONNX составило 1.13 × 10⁻⁶; все прогнозы совпали. Совпадение предобработки проверено поэлементно. Медиана инференса — 8.40 мс, p95 — 9.81 мс: </w:t>
+      </w:r>
+      <w:proofErr w:type="spellStart"/>
+      <w:r>
+        <w:rPr>
+          <w:sz w:val="28"/>
+        </w:rPr>
+        <w:t>batch</w:t>
+      </w:r>
+      <w:proofErr w:type="spellEnd"/>
+      <w:r>
+        <w:rPr>
+          <w:sz w:val="28"/>
+        </w:rPr>
+        <w:t xml:space="preserve"> 1, два потока CPU, 10 прогревов и 50 измерений без предобработки.</w:t>
       </w:r>
     </w:p>
     <w:p>
       <w:pPr>
         <w:keepNext/>
-        <w:spacing w:after="0"/>
         <w:jc w:val="center"/>
       </w:pPr>
       <w:r>
+        <w:rPr>
+          <w:noProof/>
+        </w:rPr>
+        <w:lastRenderedPageBreak/>
         <w:drawing>
-          <wp:inline xmlns:a="http://schemas.openxmlformats.org/drawingml/2006/main" xmlns:pic="http://schemas.openxmlformats.org/drawingml/2006/picture">
+          <wp:inline distT="0" distB="0" distL="0" distR="0" wp14:anchorId="09ABAE20" wp14:editId="1A43B601">
             <wp:extent cx="2520000" cy="4602293"/>
+            <wp:effectExtent l="0" t="0" r="0" b="0"/>
             <wp:docPr id="6" name="Picture 6" descr="Рисунок 6 — Работа Gradio после загрузки фотографии"/>
             <wp:cNvGraphicFramePr>
-              <a:graphicFrameLocks noChangeAspect="1"/>
+              <a:graphicFrameLocks xmlns:a="http://schemas.openxmlformats.org/drawingml/2006/main" noChangeAspect="1"/>
             </wp:cNvGraphicFramePr>
-            <a:graphic>
+            <a:graphic xmlns:a="http://schemas.openxmlformats.org/drawingml/2006/main">
               <a:graphicData uri="http://schemas.openxmlformats.org/drawingml/2006/picture">
-                <pic:pic>
+                <pic:pic xmlns:pic="http://schemas.openxmlformats.org/drawingml/2006/picture">
                   <pic:nvPicPr>
                     <pic:cNvPr id="0" name="app.png"/>
                     <pic:cNvPicPr/>
                   </pic:nvPicPr>
                   <pic:blipFill>
-                    <a:blip r:embed="rId18"/>
+                    <a:blip r:embed="rId12"/>
                     <a:stretch>
                       <a:fillRect/>
                     </a:stretch>
@@ -2771,7 +4340,9 @@
                       <a:off x="0" y="0"/>
                       <a:ext cx="2520000" cy="4602293"/>
                     </a:xfrm>
-                    <a:prstGeom prst="rect"/>
+                    <a:prstGeom prst="rect">
+                      <a:avLst/>
+                    </a:prstGeom>
                   </pic:spPr>
                 </pic:pic>
               </a:graphicData>
@@ -2783,202 +4354,486 @@
     <w:p>
       <w:pPr>
         <w:widowControl/>
-        <w:spacing w:line="240" w:lineRule="auto" w:after="100" w:before="0"/>
+        <w:spacing w:after="100"/>
         <w:jc w:val="center"/>
       </w:pPr>
       <w:r>
         <w:rPr>
-          <w:rFonts w:ascii="Times New Roman" w:hAnsi="Times New Roman"/>
-          <w:b w:val="0"/>
           <w:sz w:val="24"/>
         </w:rPr>
-        <w:t>Рисунок 6 — Работа Gradio после загрузки фотографии</w:t>
+        <w:t xml:space="preserve">Рисунок 6 — Работа </w:t>
+      </w:r>
+      <w:proofErr w:type="spellStart"/>
+      <w:r>
+        <w:rPr>
+          <w:sz w:val="24"/>
+        </w:rPr>
+        <w:t>Gradio</w:t>
+      </w:r>
+      <w:proofErr w:type="spellEnd"/>
+      <w:r>
+        <w:rPr>
+          <w:sz w:val="24"/>
+        </w:rPr>
+        <w:t xml:space="preserve"> после загрузки фотографии</w:t>
       </w:r>
     </w:p>
     <w:p>
       <w:pPr>
         <w:widowControl/>
-        <w:spacing w:line="360" w:lineRule="auto" w:after="100" w:before="0"/>
+        <w:spacing w:after="100" w:line="360" w:lineRule="auto"/>
         <w:jc w:val="both"/>
       </w:pPr>
       <w:r>
         <w:rPr>
-          <w:rFonts w:ascii="Times New Roman" w:hAnsi="Times New Roman"/>
-          <w:b w:val="0"/>
           <w:sz w:val="24"/>
         </w:rPr>
-        <w:t>Приложение проверено через API и браузер: загрузка фото, Submit, вывод класса и трёх оценок. Также оно собрано в отдельном окружении без PyTorch. Запуск из корня: python -m app.app; адрес http://127.0.0.1:7860. Параметры share=False и 127.0.0.1 задают локальный режим.</w:t>
+        <w:t xml:space="preserve">Приложение проверено через API и браузер: загрузка фото, </w:t>
+      </w:r>
+      <w:proofErr w:type="spellStart"/>
+      <w:r>
+        <w:rPr>
+          <w:sz w:val="24"/>
+        </w:rPr>
+        <w:t>Submit</w:t>
+      </w:r>
+      <w:proofErr w:type="spellEnd"/>
+      <w:r>
+        <w:rPr>
+          <w:sz w:val="24"/>
+        </w:rPr>
+        <w:t xml:space="preserve">, вывод класса и трёх оценок. Также оно собрано в отдельном окружении без </w:t>
+      </w:r>
+      <w:proofErr w:type="spellStart"/>
+      <w:r>
+        <w:rPr>
+          <w:sz w:val="24"/>
+        </w:rPr>
+        <w:t>PyTorch</w:t>
+      </w:r>
+      <w:proofErr w:type="spellEnd"/>
+      <w:r>
+        <w:rPr>
+          <w:sz w:val="24"/>
+        </w:rPr>
+        <w:t xml:space="preserve">. Запуск из корня: </w:t>
+      </w:r>
+      <w:proofErr w:type="spellStart"/>
+      <w:r>
+        <w:rPr>
+          <w:sz w:val="24"/>
+        </w:rPr>
+        <w:t>python</w:t>
+      </w:r>
+      <w:proofErr w:type="spellEnd"/>
+      <w:r>
+        <w:rPr>
+          <w:sz w:val="24"/>
+        </w:rPr>
+        <w:t xml:space="preserve"> -m </w:t>
+      </w:r>
+      <w:proofErr w:type="spellStart"/>
+      <w:r>
+        <w:rPr>
+          <w:sz w:val="24"/>
+        </w:rPr>
+        <w:t>app.app</w:t>
+      </w:r>
+      <w:proofErr w:type="spellEnd"/>
+      <w:r>
+        <w:rPr>
+          <w:sz w:val="24"/>
+        </w:rPr>
+        <w:t xml:space="preserve">; адрес http://127.0.0.1:7860. Параметры </w:t>
+      </w:r>
+      <w:proofErr w:type="spellStart"/>
+      <w:r>
+        <w:rPr>
+          <w:sz w:val="24"/>
+        </w:rPr>
+        <w:t>share</w:t>
+      </w:r>
+      <w:proofErr w:type="spellEnd"/>
+      <w:r>
+        <w:rPr>
+          <w:sz w:val="24"/>
+        </w:rPr>
+        <w:t>=</w:t>
+      </w:r>
+      <w:proofErr w:type="spellStart"/>
+      <w:r>
+        <w:rPr>
+          <w:sz w:val="24"/>
+        </w:rPr>
+        <w:t>False</w:t>
+      </w:r>
+      <w:proofErr w:type="spellEnd"/>
+      <w:r>
+        <w:rPr>
+          <w:sz w:val="24"/>
+        </w:rPr>
+        <w:t xml:space="preserve"> и 127.0.0.1 задают локальный режим.</w:t>
       </w:r>
     </w:p>
     <w:p>
       <w:pPr>
         <w:keepNext/>
-        <w:pageBreakBefore w:val="0"/>
         <w:widowControl/>
-        <w:spacing w:line="360" w:lineRule="auto" w:after="100" w:before="0"/>
+        <w:spacing w:after="100" w:line="360" w:lineRule="auto"/>
         <w:jc w:val="both"/>
       </w:pPr>
       <w:r>
         <w:rPr>
-          <w:rFonts w:ascii="Times New Roman" w:hAnsi="Times New Roman"/>
           <w:b/>
           <w:sz w:val="28"/>
         </w:rPr>
-        <w:t>Сопоставление с образцом и вывод</w:t>
+        <w:t>Вывод</w:t>
       </w:r>
     </w:p>
     <w:p>
       <w:pPr>
         <w:widowControl/>
-        <w:spacing w:line="360" w:lineRule="auto" w:after="100" w:before="0"/>
+        <w:spacing w:after="100" w:line="360" w:lineRule="auto"/>
         <w:jc w:val="both"/>
       </w:pPr>
       <w:r>
         <w:rPr>
-          <w:rFonts w:ascii="Times New Roman" w:hAnsi="Times New Roman"/>
-          <w:b w:val="0"/>
-          <w:sz w:val="28"/>
-        </w:rPr>
-        <w:t>В предоставленном отчёте Шатило сравниваются ResNet18 и EfficientNet-B0 на 180 природных сценах forest, mountain и sea. Указаны 20 эпох и test accuracy 76.67% и 93.33%. Наши данные, модели и протокол отличаются, поэтому прямой рейтинг процентов между отчётами некорректен.</w:t>
+          <w:sz w:val="28"/>
+        </w:rPr>
+        <w:t xml:space="preserve">Реализован полный цикл от отбора 116 открытых фотографий до локального инференса. ResNet18 дала максимальную </w:t>
+      </w:r>
+      <w:proofErr w:type="spellStart"/>
+      <w:r>
+        <w:rPr>
+          <w:sz w:val="28"/>
+        </w:rPr>
+        <w:t>validation</w:t>
+      </w:r>
+      <w:proofErr w:type="spellEnd"/>
+      <w:r>
+        <w:rPr>
+          <w:sz w:val="28"/>
+        </w:rPr>
+        <w:t xml:space="preserve"> </w:t>
+      </w:r>
+      <w:proofErr w:type="spellStart"/>
+      <w:r>
+        <w:rPr>
+          <w:sz w:val="28"/>
+        </w:rPr>
+        <w:t>accuracy</w:t>
+      </w:r>
+      <w:proofErr w:type="spellEnd"/>
+      <w:r>
+        <w:rPr>
+          <w:sz w:val="28"/>
+        </w:rPr>
+        <w:t xml:space="preserve"> и 25/25 на </w:t>
+      </w:r>
+      <w:proofErr w:type="spellStart"/>
+      <w:r>
+        <w:rPr>
+          <w:sz w:val="28"/>
+        </w:rPr>
+        <w:t>test</w:t>
+      </w:r>
+      <w:proofErr w:type="spellEnd"/>
+      <w:r>
+        <w:rPr>
+          <w:sz w:val="28"/>
+        </w:rPr>
+        <w:t xml:space="preserve">; MobileNetV3 — 23/25 при значительно меньшем размере сети. Для приложения выбрана ResNet18. На данном наборе её </w:t>
+      </w:r>
+      <w:proofErr w:type="spellStart"/>
+      <w:r>
+        <w:rPr>
+          <w:sz w:val="28"/>
+        </w:rPr>
+        <w:t>pretrained</w:t>
+      </w:r>
+      <w:proofErr w:type="spellEnd"/>
+      <w:r>
+        <w:rPr>
+          <w:sz w:val="28"/>
+        </w:rPr>
+        <w:t>-признаков оказалось достаточно после обучения головы; дообучение всей сети не улучшило критерий отбора.</w:t>
       </w:r>
     </w:p>
     <w:p>
       <w:pPr>
         <w:widowControl/>
-        <w:spacing w:line="360" w:lineRule="auto" w:after="100" w:before="0"/>
+        <w:spacing w:after="100" w:line="360" w:lineRule="auto"/>
         <w:jc w:val="both"/>
       </w:pPr>
       <w:r>
         <w:rPr>
-          <w:rFonts w:ascii="Times New Roman" w:hAnsi="Times New Roman"/>
-          <w:b w:val="0"/>
-          <w:sz w:val="28"/>
-        </w:rPr>
-        <w:t>Сохранён порядок изложения образца: цель, данные, архитектуры, кривые, матрицы, экспорт и вывод. В образце ONNX и Gradio описаны как возможные последующие действия. В этом проекте сохранён реальный ONNX, создано и проверено приложение. Дополнительно представлены четыре конфигурации поиска, источники и лицензии изображений, разделение по авторам и проверка повторяемости.</w:t>
+          <w:sz w:val="28"/>
+        </w:rPr>
+        <w:lastRenderedPageBreak/>
+        <w:t xml:space="preserve">Проект содержит train.py с </w:t>
+      </w:r>
+      <w:proofErr w:type="spellStart"/>
+      <w:r>
+        <w:rPr>
+          <w:sz w:val="28"/>
+        </w:rPr>
+        <w:t>dataclass</w:t>
+      </w:r>
+      <w:proofErr w:type="spellEnd"/>
+      <w:r>
+        <w:rPr>
+          <w:sz w:val="28"/>
+        </w:rPr>
+        <w:t xml:space="preserve">, исполненный </w:t>
+      </w:r>
+      <w:proofErr w:type="spellStart"/>
+      <w:r>
+        <w:rPr>
+          <w:sz w:val="28"/>
+        </w:rPr>
+        <w:t>notebook</w:t>
+      </w:r>
+      <w:proofErr w:type="spellEnd"/>
+      <w:r>
+        <w:rPr>
+          <w:sz w:val="28"/>
+        </w:rPr>
+        <w:t xml:space="preserve"> с настоящими логами, графики четырёх запусков, матрицы ошибок, конфигурацию победителя и ONNX. Исходники, данные и отчёт размещаются в репозитории https://github.com/NoirBTW/Lab3Neuro. Подробные команды установки, оценки и запуска приведены в README.md.</w:t>
       </w:r>
     </w:p>
     <w:p>
       <w:pPr>
         <w:keepNext/>
-        <w:pageBreakBefore w:val="0"/>
         <w:widowControl/>
-        <w:spacing w:line="360" w:lineRule="auto" w:after="100" w:before="0"/>
+        <w:spacing w:after="100" w:line="360" w:lineRule="auto"/>
         <w:jc w:val="both"/>
-      </w:pPr>
-      <w:r>
-        <w:rPr>
-          <w:rFonts w:ascii="Times New Roman" w:hAnsi="Times New Roman"/>
+        <w:rPr>
+          <w:lang w:val="en-US"/>
+        </w:rPr>
+      </w:pPr>
+      <w:r>
+        <w:rPr>
           <w:b/>
           <w:sz w:val="28"/>
         </w:rPr>
-        <w:t>Вывод</w:t>
+        <w:t>Источники</w:t>
       </w:r>
     </w:p>
     <w:p>
       <w:pPr>
         <w:widowControl/>
-        <w:spacing w:line="360" w:lineRule="auto" w:after="100" w:before="0"/>
+        <w:spacing w:after="100"/>
         <w:jc w:val="both"/>
-      </w:pPr>
-      <w:r>
-        <w:rPr>
-          <w:rFonts w:ascii="Times New Roman" w:hAnsi="Times New Roman"/>
-          <w:b w:val="0"/>
-          <w:sz w:val="28"/>
-        </w:rPr>
-        <w:t>Реализован полный цикл от отбора 116 открытых фотографий до локального инференса. ResNet18 дала максимальную validation accuracy и 25/25 на test; MobileNetV3 — 23/25 при значительно меньшем размере сети. Для приложения выбрана ResNet18. На данном наборе её pretrained-признаков оказалось достаточно после обучения головы; дообучение всей сети не улучшило критерий отбора.</w:t>
+        <w:rPr>
+          <w:lang w:val="en-US"/>
+        </w:rPr>
+      </w:pPr>
+      <w:r>
+        <w:rPr>
+          <w:sz w:val="24"/>
+          <w:lang w:val="en-US"/>
+        </w:rPr>
+        <w:t xml:space="preserve">1. </w:t>
+      </w:r>
+      <w:proofErr w:type="spellStart"/>
+      <w:r>
+        <w:rPr>
+          <w:sz w:val="24"/>
+          <w:lang w:val="en-US"/>
+        </w:rPr>
+        <w:t>timm</w:t>
+      </w:r>
+      <w:proofErr w:type="spellEnd"/>
+      <w:r>
+        <w:rPr>
+          <w:sz w:val="24"/>
+          <w:lang w:val="en-US"/>
+        </w:rPr>
+        <w:t xml:space="preserve"> ResNet18 model card — https://huggingface.co/timm/resnet18.a1_in1k</w:t>
       </w:r>
     </w:p>
     <w:p>
       <w:pPr>
         <w:widowControl/>
-        <w:spacing w:line="360" w:lineRule="auto" w:after="100" w:before="0"/>
+        <w:spacing w:after="100"/>
         <w:jc w:val="both"/>
-      </w:pPr>
-      <w:r>
-        <w:rPr>
-          <w:rFonts w:ascii="Times New Roman" w:hAnsi="Times New Roman"/>
-          <w:b w:val="0"/>
-          <w:sz w:val="28"/>
-        </w:rPr>
-        <w:t>Проект содержит train.py с dataclass, исполненный notebook с настоящими логами, графики четырёх запусков, матрицы ошибок, конфигурацию победителя и ONNX. Исходники, данные и отчёт размещаются в репозитории https://github.com/NoirBTW/Lab3Neuro. Подробные команды установки, оценки и запуска приведены в README.md.</w:t>
-      </w:r>
-    </w:p>
-    <w:p>
-      <w:pPr>
-        <w:keepNext/>
-        <w:pageBreakBefore w:val="0"/>
+        <w:rPr>
+          <w:lang w:val="en-US"/>
+        </w:rPr>
+      </w:pPr>
+      <w:r>
+        <w:rPr>
+          <w:sz w:val="24"/>
+          <w:lang w:val="en-US"/>
+        </w:rPr>
+        <w:t xml:space="preserve">2. </w:t>
+      </w:r>
+      <w:proofErr w:type="spellStart"/>
+      <w:r>
+        <w:rPr>
+          <w:sz w:val="24"/>
+          <w:lang w:val="en-US"/>
+        </w:rPr>
+        <w:t>timm</w:t>
+      </w:r>
+      <w:proofErr w:type="spellEnd"/>
+      <w:r>
+        <w:rPr>
+          <w:sz w:val="24"/>
+          <w:lang w:val="en-US"/>
+        </w:rPr>
+        <w:t xml:space="preserve"> MobileNetV3 Small model card — https://huggingface.co/timm/mobilenetv3_small_100.lamb_in1k</w:t>
+      </w:r>
+    </w:p>
+    <w:p>
+      <w:pPr>
         <w:widowControl/>
-        <w:spacing w:line="360" w:lineRule="auto" w:after="100" w:before="0"/>
+        <w:spacing w:after="100"/>
         <w:jc w:val="both"/>
-      </w:pPr>
-      <w:r>
-        <w:rPr>
-          <w:rFonts w:ascii="Times New Roman" w:hAnsi="Times New Roman"/>
-          <w:b/>
-          <w:sz w:val="28"/>
-        </w:rPr>
-        <w:t>Источники</w:t>
+        <w:rPr>
+          <w:lang w:val="en-US"/>
+        </w:rPr>
+      </w:pPr>
+      <w:r>
+        <w:rPr>
+          <w:sz w:val="24"/>
+          <w:lang w:val="en-US"/>
+        </w:rPr>
+        <w:t>3. ONNX Runtime Python API — https://onnxruntime.ai/docs/api/python/api_summary.html</w:t>
       </w:r>
     </w:p>
     <w:p>
       <w:pPr>
         <w:widowControl/>
-        <w:spacing w:line="240" w:lineRule="auto" w:after="100" w:before="0"/>
+        <w:spacing w:after="100"/>
         <w:jc w:val="both"/>
-      </w:pPr>
-      <w:r>
-        <w:rPr>
-          <w:rFonts w:ascii="Times New Roman" w:hAnsi="Times New Roman"/>
-          <w:b w:val="0"/>
+        <w:rPr>
+          <w:lang w:val="en-US"/>
+        </w:rPr>
+      </w:pPr>
+      <w:r>
+        <w:rPr>
           <w:sz w:val="24"/>
-        </w:rPr>
-        <w:t>1. timm ResNet18 model card — https://huggingface.co/timm/resnet18.a1_in1k</w:t>
-      </w:r>
-    </w:p>
-    <w:p>
-      <w:pPr>
-        <w:widowControl/>
-        <w:spacing w:line="240" w:lineRule="auto" w:after="100" w:before="0"/>
-        <w:jc w:val="both"/>
-      </w:pPr>
-      <w:r>
-        <w:rPr>
-          <w:rFonts w:ascii="Times New Roman" w:hAnsi="Times New Roman"/>
-          <w:b w:val="0"/>
+          <w:lang w:val="en-US"/>
+        </w:rPr>
+        <w:t xml:space="preserve">4. Wikimedia Commons. </w:t>
+      </w:r>
+      <w:r>
+        <w:rPr>
           <w:sz w:val="24"/>
         </w:rPr>
-        <w:t>2. timm MobileNetV3 Small model card — https://huggingface.co/timm/mobilenetv3_small_100.lamb_in1k</w:t>
-      </w:r>
-    </w:p>
-    <w:p>
-      <w:pPr>
-        <w:widowControl/>
-        <w:spacing w:line="240" w:lineRule="auto" w:after="100" w:before="0"/>
-        <w:jc w:val="both"/>
-      </w:pPr>
-      <w:r>
-        <w:rPr>
-          <w:rFonts w:ascii="Times New Roman" w:hAnsi="Times New Roman"/>
-          <w:b w:val="0"/>
+        <w:t>Индивидуальные</w:t>
+      </w:r>
+      <w:r>
+        <w:rPr>
           <w:sz w:val="24"/>
-        </w:rPr>
-        <w:t>3. ONNX Runtime Python API — https://onnxruntime.ai/docs/api/python/api_summary.html</w:t>
-      </w:r>
-    </w:p>
-    <w:p>
-      <w:pPr>
-        <w:widowControl/>
-        <w:spacing w:line="240" w:lineRule="auto" w:after="100" w:before="0"/>
-        <w:jc w:val="both"/>
-      </w:pPr>
-      <w:r>
-        <w:rPr>
-          <w:rFonts w:ascii="Times New Roman" w:hAnsi="Times New Roman"/>
-          <w:b w:val="0"/>
+          <w:lang w:val="en-US"/>
+        </w:rPr>
+        <w:t xml:space="preserve"> </w:t>
+      </w:r>
+      <w:r>
+        <w:rPr>
           <w:sz w:val="24"/>
         </w:rPr>
-        <w:t>4. Wikimedia Commons. Индивидуальные авторы, лицензии и ссылки: experiments/data/ATTRIBUTION.md. Дата сбора и обращения: 07.09.2026.</w:t>
+        <w:t>авторы</w:t>
+      </w:r>
+      <w:r>
+        <w:rPr>
+          <w:sz w:val="24"/>
+          <w:lang w:val="en-US"/>
+        </w:rPr>
+        <w:t xml:space="preserve">, </w:t>
+      </w:r>
+      <w:r>
+        <w:rPr>
+          <w:sz w:val="24"/>
+        </w:rPr>
+        <w:t>лицензии</w:t>
+      </w:r>
+      <w:r>
+        <w:rPr>
+          <w:sz w:val="24"/>
+          <w:lang w:val="en-US"/>
+        </w:rPr>
+        <w:t xml:space="preserve"> </w:t>
+      </w:r>
+      <w:r>
+        <w:rPr>
+          <w:sz w:val="24"/>
+        </w:rPr>
+        <w:t>и</w:t>
+      </w:r>
+      <w:r>
+        <w:rPr>
+          <w:sz w:val="24"/>
+          <w:lang w:val="en-US"/>
+        </w:rPr>
+        <w:t xml:space="preserve"> </w:t>
+      </w:r>
+      <w:r>
+        <w:rPr>
+          <w:sz w:val="24"/>
+        </w:rPr>
+        <w:t>ссылки</w:t>
+      </w:r>
+      <w:r>
+        <w:rPr>
+          <w:sz w:val="24"/>
+          <w:lang w:val="en-US"/>
+        </w:rPr>
+        <w:t xml:space="preserve">: experiments/data/ATTRIBUTION.md. </w:t>
+      </w:r>
+      <w:r>
+        <w:rPr>
+          <w:sz w:val="24"/>
+        </w:rPr>
+        <w:t>Дата</w:t>
+      </w:r>
+      <w:r>
+        <w:rPr>
+          <w:sz w:val="24"/>
+          <w:lang w:val="en-US"/>
+        </w:rPr>
+        <w:t xml:space="preserve"> </w:t>
+      </w:r>
+      <w:r>
+        <w:rPr>
+          <w:sz w:val="24"/>
+        </w:rPr>
+        <w:t>сбора</w:t>
+      </w:r>
+      <w:r>
+        <w:rPr>
+          <w:sz w:val="24"/>
+          <w:lang w:val="en-US"/>
+        </w:rPr>
+        <w:t xml:space="preserve"> </w:t>
+      </w:r>
+      <w:r>
+        <w:rPr>
+          <w:sz w:val="24"/>
+        </w:rPr>
+        <w:t>и</w:t>
+      </w:r>
+      <w:r>
+        <w:rPr>
+          <w:sz w:val="24"/>
+          <w:lang w:val="en-US"/>
+        </w:rPr>
+        <w:t xml:space="preserve"> </w:t>
+      </w:r>
+      <w:r>
+        <w:rPr>
+          <w:sz w:val="24"/>
+        </w:rPr>
+        <w:t>обращения</w:t>
+      </w:r>
+      <w:r>
+        <w:rPr>
+          <w:sz w:val="24"/>
+          <w:lang w:val="en-US"/>
+        </w:rPr>
+        <w:t>: 07.09.2026.</w:t>
       </w:r>
     </w:p>
     <w:sectPr>

</xml_diff>